<commit_message>
fix: clarify report security governance scope
</commit_message>
<xml_diff>
--- a/deliverables/关于巡防百科网站建设及推广应用情况的报告.docx
+++ b/deliverables/关于巡防百科网站建设及推广应用情况的报告.docx
@@ -800,7 +800,7 @@
                 <w:b w:val="0"/>
                 <w:sz w:val="28"/>
               </w:rPr>
-              <w:t>开展敏感内容删除整改、访问范围控制、历史访问权限失效验证，并对公开法规和公开网页来源进行核验。</w:t>
+              <w:t>开展敏感内容排查和相关内容调整、访问凭据更新、旧凭据失效验证，并对公开法规和公开网页来源进行核验。</w:t>
             </w:r>
           </w:p>
         </w:tc>
@@ -828,7 +828,7 @@
                 <w:b w:val="0"/>
                 <w:sz w:val="28"/>
               </w:rPr>
-              <w:t>降低不当信息展示风险，同时明确公开来源核验不替代单位内部业务、保密和发布审批。</w:t>
+              <w:t>为继续完善内容治理和审查把关提供依据，同时明确公开来源核验不替代单位内部业务、保密和发布审批。</w:t>
             </w:r>
           </w:p>
         </w:tc>
@@ -980,7 +980,7 @@
           <w:b/>
           <w:sz w:val="32"/>
         </w:rPr>
-        <w:t>（二）把安全治理贯穿建设全过程</w:t>
+        <w:t>（二）明确现阶段应用范围和持续治理要求</w:t>
       </w:r>
     </w:p>
     <w:p>
@@ -995,7 +995,7 @@
           <w:b w:val="0"/>
           <w:sz w:val="32"/>
         </w:rPr>
-        <w:t>项目坚持最小范围使用和必要内容呈现，现阶段严格限定在大队内部试用。对可能涉及敏感警务信息、内部工作细节或者不适宜展示的内容，采取删除、脱敏、限制访问等措施；对历史访问权限进行失效验证，对页面更新前后的展示范围进行复核。内容建设不记录、不传播与使用目的无关的信息，不在报告和普通页面中展示安全配置细节。</w:t>
+        <w:t>网站当前预定应用范围为大队内部试用。建设过程中已完成的安全相关工作，主要包括敏感内容排查和相关内容调整、访问凭据更新、旧凭据失效验证。上述工作用于支持现阶段试用管理，但不能替代单位内部审查。对后续新增、修改或者拟扩大使用范围的内容，必须按权限完成业务审查、保密审查和发布审查，未完成相应审查前不作扩展使用。</w:t>
       </w:r>
     </w:p>
     <w:p>

</xml_diff>

<commit_message>
fix: pass report visual QA
</commit_message>
<xml_diff>
--- a/deliverables/关于巡防百科网站建设及推广应用情况的报告.docx
+++ b/deliverables/关于巡防百科网站建设及推广应用情况的报告.docx
@@ -16,7 +16,9 @@
           <w:b w:val="0"/>
           <w:sz w:val="44"/>
         </w:rPr>
-        <w:t>关于“巡防百科”网站建设及推广应用情况的报告</w:t>
+        <w:t>关于“巡防百科”网站建设及</w:t>
+        <w:br/>
+        <w:t>推广应用情况的报告</w:t>
       </w:r>
     </w:p>
     <w:p>
@@ -400,6 +402,7 @@
       <w:tr>
         <w:trPr>
           <w:tblHeader w:val="true"/>
+          <w:cantSplit/>
         </w:trPr>
         <w:tc>
           <w:tcPr>
@@ -490,6 +493,9 @@
         </w:tc>
       </w:tr>
       <w:tr>
+        <w:trPr>
+          <w:cantSplit/>
+        </w:trPr>
         <w:tc>
           <w:tcPr>
             <w:tcW w:type="dxa" w:w="1814"/>
@@ -576,6 +582,9 @@
         </w:tc>
       </w:tr>
       <w:tr>
+        <w:trPr>
+          <w:cantSplit/>
+        </w:trPr>
         <w:tc>
           <w:tcPr>
             <w:tcW w:type="dxa" w:w="1814"/>
@@ -662,6 +671,9 @@
         </w:tc>
       </w:tr>
       <w:tr>
+        <w:trPr>
+          <w:cantSplit/>
+        </w:trPr>
         <w:tc>
           <w:tcPr>
             <w:tcW w:type="dxa" w:w="1814"/>
@@ -748,6 +760,9 @@
         </w:tc>
       </w:tr>
       <w:tr>
+        <w:trPr>
+          <w:cantSplit/>
+        </w:trPr>
         <w:tc>
           <w:tcPr>
             <w:tcW w:type="dxa" w:w="1814"/>
@@ -834,6 +849,9 @@
         </w:tc>
       </w:tr>
       <w:tr>
+        <w:trPr>
+          <w:cantSplit/>
+        </w:trPr>
         <w:tc>
           <w:tcPr>
             <w:tcW w:type="dxa" w:w="1814"/>

</xml_diff>

<commit_message>
fix: make report DOCX deterministic
</commit_message>
<xml_diff>
--- a/deliverables/关于巡防百科网站建设及推广应用情况的报告.docx
+++ b/deliverables/关于巡防百科网站建设及推广应用情况的报告.docx
@@ -40,6 +40,7 @@
       <w:pPr>
         <w:pStyle w:val="Heading1"/>
         <w:keepNext/>
+        <w:spacing w:lineRule="exact" w:line="560" w:before="280" w:after="0"/>
         <w:ind w:firstLine="0"/>
         <w:jc w:val="left"/>
       </w:pPr>
@@ -56,6 +57,7 @@
       <w:pPr>
         <w:pStyle w:val="Heading2"/>
         <w:keepNext/>
+        <w:spacing w:lineRule="exact" w:line="560" w:before="160" w:after="0"/>
         <w:ind w:firstLine="0"/>
         <w:jc w:val="left"/>
       </w:pPr>
@@ -87,6 +89,7 @@
       <w:pPr>
         <w:pStyle w:val="Heading2"/>
         <w:keepNext/>
+        <w:spacing w:lineRule="exact" w:line="560" w:before="160" w:after="0"/>
         <w:ind w:firstLine="0"/>
         <w:jc w:val="left"/>
       </w:pPr>
@@ -118,6 +121,7 @@
       <w:pPr>
         <w:pStyle w:val="Heading2"/>
         <w:keepNext/>
+        <w:spacing w:lineRule="exact" w:line="560" w:before="160" w:after="0"/>
         <w:ind w:firstLine="0"/>
         <w:jc w:val="left"/>
       </w:pPr>
@@ -149,6 +153,7 @@
       <w:pPr>
         <w:pStyle w:val="Heading1"/>
         <w:keepNext/>
+        <w:spacing w:lineRule="exact" w:line="560" w:before="280" w:after="0"/>
         <w:ind w:firstLine="0"/>
         <w:jc w:val="left"/>
       </w:pPr>
@@ -165,6 +170,7 @@
       <w:pPr>
         <w:pStyle w:val="Heading2"/>
         <w:keepNext/>
+        <w:spacing w:lineRule="exact" w:line="560" w:before="160" w:after="0"/>
         <w:ind w:firstLine="0"/>
         <w:jc w:val="left"/>
       </w:pPr>
@@ -196,6 +202,7 @@
       <w:pPr>
         <w:pStyle w:val="Heading2"/>
         <w:keepNext/>
+        <w:spacing w:lineRule="exact" w:line="560" w:before="160" w:after="0"/>
         <w:ind w:firstLine="0"/>
         <w:jc w:val="left"/>
       </w:pPr>
@@ -227,6 +234,7 @@
       <w:pPr>
         <w:pStyle w:val="Heading2"/>
         <w:keepNext/>
+        <w:spacing w:lineRule="exact" w:line="560" w:before="160" w:after="0"/>
         <w:ind w:firstLine="0"/>
         <w:jc w:val="left"/>
       </w:pPr>
@@ -258,6 +266,7 @@
       <w:pPr>
         <w:pStyle w:val="Heading1"/>
         <w:keepNext/>
+        <w:spacing w:lineRule="exact" w:line="560" w:before="280" w:after="0"/>
         <w:ind w:firstLine="0"/>
         <w:jc w:val="left"/>
       </w:pPr>
@@ -274,6 +283,7 @@
       <w:pPr>
         <w:pStyle w:val="Heading2"/>
         <w:keepNext/>
+        <w:spacing w:lineRule="exact" w:line="560" w:before="160" w:after="0"/>
         <w:ind w:firstLine="0"/>
         <w:jc w:val="left"/>
       </w:pPr>
@@ -305,6 +315,7 @@
       <w:pPr>
         <w:pStyle w:val="Heading2"/>
         <w:keepNext/>
+        <w:spacing w:lineRule="exact" w:line="560" w:before="160" w:after="0"/>
         <w:ind w:firstLine="0"/>
         <w:jc w:val="left"/>
       </w:pPr>
@@ -336,6 +347,7 @@
       <w:pPr>
         <w:pStyle w:val="Heading2"/>
         <w:keepNext/>
+        <w:spacing w:lineRule="exact" w:line="560" w:before="160" w:after="0"/>
         <w:ind w:firstLine="0"/>
         <w:jc w:val="left"/>
       </w:pPr>
@@ -942,6 +954,7 @@
       <w:pPr>
         <w:pStyle w:val="Heading1"/>
         <w:keepNext/>
+        <w:spacing w:lineRule="exact" w:line="560" w:before="280" w:after="0"/>
         <w:ind w:firstLine="0"/>
         <w:jc w:val="left"/>
       </w:pPr>
@@ -958,6 +971,7 @@
       <w:pPr>
         <w:pStyle w:val="Heading2"/>
         <w:keepNext/>
+        <w:spacing w:lineRule="exact" w:line="560" w:before="160" w:after="0"/>
         <w:ind w:firstLine="0"/>
         <w:jc w:val="left"/>
       </w:pPr>
@@ -989,6 +1003,7 @@
       <w:pPr>
         <w:pStyle w:val="Heading2"/>
         <w:keepNext/>
+        <w:spacing w:lineRule="exact" w:line="560" w:before="160" w:after="0"/>
         <w:ind w:firstLine="0"/>
         <w:jc w:val="left"/>
       </w:pPr>
@@ -1020,6 +1035,7 @@
       <w:pPr>
         <w:pStyle w:val="Heading2"/>
         <w:keepNext/>
+        <w:spacing w:lineRule="exact" w:line="560" w:before="160" w:after="0"/>
         <w:ind w:firstLine="0"/>
         <w:jc w:val="left"/>
       </w:pPr>
@@ -1051,6 +1067,7 @@
       <w:pPr>
         <w:pStyle w:val="Heading2"/>
         <w:keepNext/>
+        <w:spacing w:lineRule="exact" w:line="560" w:before="160" w:after="0"/>
         <w:ind w:firstLine="0"/>
         <w:jc w:val="left"/>
       </w:pPr>
@@ -1082,6 +1099,7 @@
       <w:pPr>
         <w:pStyle w:val="Heading1"/>
         <w:keepNext/>
+        <w:spacing w:lineRule="exact" w:line="560" w:before="280" w:after="0"/>
         <w:ind w:firstLine="0"/>
         <w:jc w:val="left"/>
       </w:pPr>
@@ -1098,6 +1116,7 @@
       <w:pPr>
         <w:pStyle w:val="Heading2"/>
         <w:keepNext/>
+        <w:spacing w:lineRule="exact" w:line="560" w:before="160" w:after="0"/>
         <w:ind w:firstLine="0"/>
         <w:jc w:val="left"/>
       </w:pPr>
@@ -1129,6 +1148,7 @@
       <w:pPr>
         <w:pStyle w:val="Heading2"/>
         <w:keepNext/>
+        <w:spacing w:lineRule="exact" w:line="560" w:before="160" w:after="0"/>
         <w:ind w:firstLine="0"/>
         <w:jc w:val="left"/>
       </w:pPr>
@@ -1160,6 +1180,7 @@
       <w:pPr>
         <w:pStyle w:val="Heading2"/>
         <w:keepNext/>
+        <w:spacing w:lineRule="exact" w:line="560" w:before="160" w:after="0"/>
         <w:ind w:firstLine="0"/>
         <w:jc w:val="left"/>
       </w:pPr>
@@ -1191,6 +1212,7 @@
       <w:pPr>
         <w:pStyle w:val="Heading1"/>
         <w:keepNext/>
+        <w:spacing w:lineRule="exact" w:line="560" w:before="280" w:after="0"/>
         <w:ind w:firstLine="0"/>
         <w:jc w:val="left"/>
       </w:pPr>
@@ -1207,6 +1229,7 @@
       <w:pPr>
         <w:pStyle w:val="Heading2"/>
         <w:keepNext/>
+        <w:spacing w:lineRule="exact" w:line="560" w:before="160" w:after="0"/>
         <w:ind w:firstLine="0"/>
         <w:jc w:val="left"/>
       </w:pPr>
@@ -1238,6 +1261,7 @@
       <w:pPr>
         <w:pStyle w:val="Heading2"/>
         <w:keepNext/>
+        <w:spacing w:lineRule="exact" w:line="560" w:before="160" w:after="0"/>
         <w:ind w:firstLine="0"/>
         <w:jc w:val="left"/>
       </w:pPr>
@@ -1269,6 +1293,7 @@
       <w:pPr>
         <w:pStyle w:val="Heading2"/>
         <w:keepNext/>
+        <w:spacing w:lineRule="exact" w:line="560" w:before="160" w:after="0"/>
         <w:ind w:firstLine="0"/>
         <w:jc w:val="left"/>
       </w:pPr>
@@ -1300,6 +1325,7 @@
       <w:pPr>
         <w:pStyle w:val="Heading2"/>
         <w:keepNext/>
+        <w:spacing w:lineRule="exact" w:line="560" w:before="160" w:after="0"/>
         <w:ind w:firstLine="0"/>
         <w:jc w:val="left"/>
       </w:pPr>
@@ -1331,6 +1357,7 @@
       <w:pPr>
         <w:pStyle w:val="Heading1"/>
         <w:keepNext/>
+        <w:spacing w:lineRule="exact" w:line="560" w:before="280" w:after="0"/>
         <w:ind w:firstLine="0"/>
         <w:jc w:val="left"/>
       </w:pPr>
@@ -1452,6 +1479,7 @@
       <w:pPr>
         <w:pStyle w:val="Heading1"/>
         <w:keepNext/>
+        <w:spacing w:lineRule="exact" w:line="560" w:before="280" w:after="0"/>
         <w:ind w:firstLine="0"/>
         <w:jc w:val="left"/>
       </w:pPr>
@@ -1461,13 +1489,14 @@
           <w:b w:val="0"/>
           <w:sz w:val="32"/>
         </w:rPr>
-        <w:t>八、结语及有关建议</w:t>
+        <w:t>八、结语及建议</w:t>
       </w:r>
     </w:p>
     <w:p>
       <w:pPr>
         <w:pStyle w:val="Heading2"/>
         <w:keepNext/>
+        <w:spacing w:lineRule="exact" w:line="560" w:before="160" w:after="0"/>
         <w:ind w:firstLine="0"/>
         <w:jc w:val="left"/>
       </w:pPr>
@@ -1499,6 +1528,7 @@
       <w:pPr>
         <w:pStyle w:val="Heading2"/>
         <w:keepNext/>
+        <w:spacing w:lineRule="exact" w:line="560" w:before="160" w:after="0"/>
         <w:ind w:firstLine="0"/>
         <w:jc w:val="left"/>
       </w:pPr>
@@ -1530,6 +1560,7 @@
       <w:pPr>
         <w:pStyle w:val="Heading2"/>
         <w:keepNext/>
+        <w:spacing w:lineRule="exact" w:line="560" w:before="160" w:after="0"/>
         <w:ind w:firstLine="0"/>
         <w:jc w:val="left"/>
       </w:pPr>
@@ -2023,7 +2054,6 @@
   <w:style w:type="paragraph" w:default="1" w:styleId="Normal">
     <w:name w:val="Normal"/>
     <w:qFormat/>
-    <w:rsid w:val="00FC693F"/>
     <w:pPr>
       <w:widowControl/>
       <w:spacing w:lineRule="exact" w:line="560" w:before="0" w:after="0"/>
@@ -2042,7 +2072,6 @@
     <w:link w:val="HeaderChar"/>
     <w:uiPriority w:val="99"/>
     <w:unhideWhenUsed/>
-    <w:rsid w:val="00E618BF"/>
     <w:pPr>
       <w:tabs>
         <w:tab w:val="center" w:pos="4680"/>
@@ -2056,7 +2085,6 @@
     <w:basedOn w:val="DefaultParagraphFont"/>
     <w:link w:val="Header"/>
     <w:uiPriority w:val="99"/>
-    <w:rsid w:val="00E618BF"/>
   </w:style>
   <w:style w:type="paragraph" w:styleId="Footer">
     <w:name w:val="footer"/>
@@ -2064,7 +2092,6 @@
     <w:link w:val="FooterChar"/>
     <w:uiPriority w:val="99"/>
     <w:unhideWhenUsed/>
-    <w:rsid w:val="00E618BF"/>
     <w:pPr>
       <w:tabs>
         <w:tab w:val="center" w:pos="4680"/>
@@ -2078,7 +2105,6 @@
     <w:basedOn w:val="DefaultParagraphFont"/>
     <w:link w:val="Footer"/>
     <w:uiPriority w:val="99"/>
-    <w:rsid w:val="00E618BF"/>
   </w:style>
   <w:style w:type="paragraph" w:styleId="Heading1">
     <w:name w:val="heading 1"/>
@@ -2087,7 +2113,6 @@
     <w:link w:val="Heading1Char"/>
     <w:uiPriority w:val="9"/>
     <w:qFormat/>
-    <w:rsid w:val="00FC693F"/>
     <w:pPr>
       <w:keepNext/>
       <w:keepLines/>
@@ -2113,7 +2138,6 @@
     <w:uiPriority w:val="9"/>
     <w:unhideWhenUsed/>
     <w:qFormat/>
-    <w:rsid w:val="00FC693F"/>
     <w:pPr>
       <w:keepNext/>
       <w:keepLines/>
@@ -2139,7 +2163,6 @@
     <w:uiPriority w:val="9"/>
     <w:unhideWhenUsed/>
     <w:qFormat/>
-    <w:rsid w:val="00FC693F"/>
     <w:pPr>
       <w:keepNext/>
       <w:keepLines/>
@@ -2162,7 +2185,6 @@
     <w:semiHidden/>
     <w:unhideWhenUsed/>
     <w:qFormat/>
-    <w:rsid w:val="00FC693F"/>
     <w:pPr>
       <w:keepNext/>
       <w:keepLines/>
@@ -2187,7 +2209,6 @@
     <w:semiHidden/>
     <w:unhideWhenUsed/>
     <w:qFormat/>
-    <w:rsid w:val="00FC693F"/>
     <w:pPr>
       <w:keepNext/>
       <w:keepLines/>
@@ -2208,7 +2229,6 @@
     <w:semiHidden/>
     <w:unhideWhenUsed/>
     <w:qFormat/>
-    <w:rsid w:val="00FC693F"/>
     <w:pPr>
       <w:keepNext/>
       <w:keepLines/>
@@ -2231,7 +2251,6 @@
     <w:semiHidden/>
     <w:unhideWhenUsed/>
     <w:qFormat/>
-    <w:rsid w:val="00FC693F"/>
     <w:pPr>
       <w:keepNext/>
       <w:keepLines/>
@@ -2254,7 +2273,6 @@
     <w:semiHidden/>
     <w:unhideWhenUsed/>
     <w:qFormat/>
-    <w:rsid w:val="00FC693F"/>
     <w:pPr>
       <w:keepNext/>
       <w:keepLines/>
@@ -2277,7 +2295,6 @@
     <w:semiHidden/>
     <w:unhideWhenUsed/>
     <w:qFormat/>
-    <w:rsid w:val="00FC693F"/>
     <w:pPr>
       <w:keepNext/>
       <w:keepLines/>
@@ -2324,7 +2341,6 @@
     <w:name w:val="No Spacing"/>
     <w:uiPriority w:val="1"/>
     <w:qFormat/>
-    <w:rsid w:val="00FC693F"/>
     <w:pPr>
       <w:spacing w:after="0" w:line="240" w:lineRule="auto"/>
     </w:pPr>
@@ -2334,7 +2350,6 @@
     <w:basedOn w:val="DefaultParagraphFont"/>
     <w:link w:val="Heading1"/>
     <w:uiPriority w:val="9"/>
-    <w:rsid w:val="00FC693F"/>
     <w:rPr>
       <w:rFonts w:asciiTheme="majorHAnsi" w:eastAsiaTheme="majorEastAsia" w:hAnsiTheme="majorHAnsi" w:cstheme="majorBidi"/>
       <w:b/>
@@ -2349,7 +2364,6 @@
     <w:basedOn w:val="DefaultParagraphFont"/>
     <w:link w:val="Heading2"/>
     <w:uiPriority w:val="9"/>
-    <w:rsid w:val="00FC693F"/>
     <w:rPr>
       <w:rFonts w:asciiTheme="majorHAnsi" w:eastAsiaTheme="majorEastAsia" w:hAnsiTheme="majorHAnsi" w:cstheme="majorBidi"/>
       <w:b/>
@@ -2364,7 +2378,6 @@
     <w:basedOn w:val="DefaultParagraphFont"/>
     <w:link w:val="Heading3"/>
     <w:uiPriority w:val="9"/>
-    <w:rsid w:val="00FC693F"/>
     <w:rPr>
       <w:rFonts w:asciiTheme="majorHAnsi" w:eastAsiaTheme="majorEastAsia" w:hAnsiTheme="majorHAnsi" w:cstheme="majorBidi"/>
       <w:b/>
@@ -2379,7 +2392,6 @@
     <w:link w:val="TitleChar"/>
     <w:uiPriority w:val="10"/>
     <w:qFormat/>
-    <w:rsid w:val="00FC693F"/>
     <w:pPr>
       <w:pBdr>
         <w:bottom w:val="single" w:sz="8" w:space="4" w:color="4F81BD" w:themeColor="accent1"/>
@@ -2401,7 +2413,6 @@
     <w:basedOn w:val="DefaultParagraphFont"/>
     <w:link w:val="Title"/>
     <w:uiPriority w:val="10"/>
-    <w:rsid w:val="00FC693F"/>
     <w:rPr>
       <w:rFonts w:asciiTheme="majorHAnsi" w:eastAsiaTheme="majorEastAsia" w:hAnsiTheme="majorHAnsi" w:cstheme="majorBidi"/>
       <w:color w:val="17365D" w:themeColor="text2" w:themeShade="BF"/>
@@ -2418,7 +2429,6 @@
     <w:link w:val="SubtitleChar"/>
     <w:uiPriority w:val="11"/>
     <w:qFormat/>
-    <w:rsid w:val="00FC693F"/>
     <w:pPr>
       <w:numPr>
         <w:ilvl w:val="1"/>
@@ -2439,7 +2449,6 @@
     <w:basedOn w:val="DefaultParagraphFont"/>
     <w:link w:val="Subtitle"/>
     <w:uiPriority w:val="11"/>
-    <w:rsid w:val="00FC693F"/>
     <w:rPr>
       <w:rFonts w:asciiTheme="majorHAnsi" w:eastAsiaTheme="majorEastAsia" w:hAnsiTheme="majorHAnsi" w:cstheme="majorBidi"/>
       <w:i/>
@@ -2455,7 +2464,6 @@
     <w:basedOn w:val="Normal"/>
     <w:uiPriority w:val="34"/>
     <w:qFormat/>
-    <w:rsid w:val="00FC693F"/>
     <w:pPr>
       <w:ind w:left="720"/>
       <w:contextualSpacing/>
@@ -2467,7 +2475,6 @@
     <w:link w:val="BodyTextChar"/>
     <w:uiPriority w:val="99"/>
     <w:unhideWhenUsed/>
-    <w:rsid w:val="00AA1D8D"/>
     <w:pPr>
       <w:spacing w:after="120"/>
     </w:pPr>
@@ -2477,7 +2484,6 @@
     <w:basedOn w:val="DefaultParagraphFont"/>
     <w:link w:val="BodyText"/>
     <w:uiPriority w:val="99"/>
-    <w:rsid w:val="00AA1D8D"/>
   </w:style>
   <w:style w:type="paragraph" w:styleId="BodyText2">
     <w:name w:val="Body Text 2"/>
@@ -2485,7 +2491,6 @@
     <w:link w:val="BodyText2Char"/>
     <w:uiPriority w:val="99"/>
     <w:unhideWhenUsed/>
-    <w:rsid w:val="00AA1D8D"/>
     <w:pPr>
       <w:spacing w:after="120" w:line="480" w:lineRule="auto"/>
     </w:pPr>
@@ -2495,7 +2500,6 @@
     <w:basedOn w:val="DefaultParagraphFont"/>
     <w:link w:val="BodyText2"/>
     <w:uiPriority w:val="99"/>
-    <w:rsid w:val="00AA1D8D"/>
   </w:style>
   <w:style w:type="paragraph" w:styleId="BodyText3">
     <w:name w:val="Body Text 3"/>
@@ -2503,7 +2507,6 @@
     <w:link w:val="BodyText3Char"/>
     <w:uiPriority w:val="99"/>
     <w:unhideWhenUsed/>
-    <w:rsid w:val="00AA1D8D"/>
     <w:pPr>
       <w:spacing w:after="120"/>
     </w:pPr>
@@ -2517,7 +2520,6 @@
     <w:basedOn w:val="DefaultParagraphFont"/>
     <w:link w:val="BodyText3"/>
     <w:uiPriority w:val="99"/>
-    <w:rsid w:val="00AA1D8D"/>
     <w:rPr>
       <w:sz w:val="16"/>
       <w:szCs w:val="16"/>
@@ -2528,7 +2530,6 @@
     <w:basedOn w:val="Normal"/>
     <w:uiPriority w:val="99"/>
     <w:unhideWhenUsed/>
-    <w:rsid w:val="00AA1D8D"/>
     <w:pPr>
       <w:ind w:left="360" w:hanging="360"/>
       <w:contextualSpacing/>
@@ -2539,7 +2540,6 @@
     <w:basedOn w:val="Normal"/>
     <w:uiPriority w:val="99"/>
     <w:unhideWhenUsed/>
-    <w:rsid w:val="00326F90"/>
     <w:pPr>
       <w:ind w:left="720" w:hanging="360"/>
       <w:contextualSpacing/>
@@ -2550,7 +2550,6 @@
     <w:basedOn w:val="Normal"/>
     <w:uiPriority w:val="99"/>
     <w:unhideWhenUsed/>
-    <w:rsid w:val="00326F90"/>
     <w:pPr>
       <w:ind w:left="1080" w:hanging="360"/>
       <w:contextualSpacing/>
@@ -2561,7 +2560,6 @@
     <w:basedOn w:val="Normal"/>
     <w:uiPriority w:val="99"/>
     <w:unhideWhenUsed/>
-    <w:rsid w:val="00326F90"/>
     <w:pPr>
       <w:numPr>
         <w:numId w:val="1"/>
@@ -2574,7 +2572,6 @@
     <w:basedOn w:val="Normal"/>
     <w:uiPriority w:val="99"/>
     <w:unhideWhenUsed/>
-    <w:rsid w:val="00326F90"/>
     <w:pPr>
       <w:numPr>
         <w:numId w:val="2"/>
@@ -2587,7 +2584,6 @@
     <w:basedOn w:val="Normal"/>
     <w:uiPriority w:val="99"/>
     <w:unhideWhenUsed/>
-    <w:rsid w:val="00326F90"/>
     <w:pPr>
       <w:numPr>
         <w:numId w:val="3"/>
@@ -2600,7 +2596,6 @@
     <w:basedOn w:val="Normal"/>
     <w:uiPriority w:val="99"/>
     <w:unhideWhenUsed/>
-    <w:rsid w:val="00326F90"/>
     <w:pPr>
       <w:widowControl/>
       <w:numPr>
@@ -2622,7 +2617,6 @@
     <w:basedOn w:val="Normal"/>
     <w:uiPriority w:val="99"/>
     <w:unhideWhenUsed/>
-    <w:rsid w:val="0029639D"/>
     <w:pPr>
       <w:numPr>
         <w:numId w:val="6"/>
@@ -2635,7 +2629,6 @@
     <w:basedOn w:val="Normal"/>
     <w:uiPriority w:val="99"/>
     <w:unhideWhenUsed/>
-    <w:rsid w:val="0029639D"/>
     <w:pPr>
       <w:numPr>
         <w:numId w:val="7"/>
@@ -2648,7 +2641,6 @@
     <w:basedOn w:val="Normal"/>
     <w:uiPriority w:val="99"/>
     <w:unhideWhenUsed/>
-    <w:rsid w:val="0029639D"/>
     <w:pPr>
       <w:spacing w:after="120"/>
       <w:ind w:left="360"/>
@@ -2660,7 +2652,6 @@
     <w:basedOn w:val="Normal"/>
     <w:uiPriority w:val="99"/>
     <w:unhideWhenUsed/>
-    <w:rsid w:val="0029639D"/>
     <w:pPr>
       <w:spacing w:after="120"/>
       <w:ind w:left="720"/>
@@ -2672,7 +2663,6 @@
     <w:basedOn w:val="Normal"/>
     <w:uiPriority w:val="99"/>
     <w:unhideWhenUsed/>
-    <w:rsid w:val="0029639D"/>
     <w:pPr>
       <w:spacing w:after="120"/>
       <w:ind w:left="1080"/>
@@ -2684,7 +2674,6 @@
     <w:link w:val="MacroTextChar"/>
     <w:uiPriority w:val="99"/>
     <w:unhideWhenUsed/>
-    <w:rsid w:val="0029639D"/>
     <w:pPr>
       <w:tabs>
         <w:tab w:val="left" w:pos="576"/>
@@ -2707,7 +2696,6 @@
     <w:basedOn w:val="DefaultParagraphFont"/>
     <w:link w:val="MacroText"/>
     <w:uiPriority w:val="99"/>
-    <w:rsid w:val="0029639D"/>
     <w:rPr>
       <w:rFonts w:ascii="Courier" w:hAnsi="Courier"/>
       <w:sz w:val="20"/>
@@ -2721,7 +2709,6 @@
     <w:link w:val="QuoteChar"/>
     <w:uiPriority w:val="29"/>
     <w:qFormat/>
-    <w:rsid w:val="00FC693F"/>
     <w:rPr>
       <w:i/>
       <w:iCs/>
@@ -2733,7 +2720,6 @@
     <w:basedOn w:val="DefaultParagraphFont"/>
     <w:link w:val="Quote"/>
     <w:uiPriority w:val="29"/>
-    <w:rsid w:val="00FC693F"/>
     <w:rPr>
       <w:i/>
       <w:iCs/>
@@ -2746,7 +2732,6 @@
     <w:link w:val="Heading4"/>
     <w:uiPriority w:val="9"/>
     <w:semiHidden/>
-    <w:rsid w:val="00FC693F"/>
     <w:rPr>
       <w:rFonts w:asciiTheme="majorHAnsi" w:eastAsiaTheme="majorEastAsia" w:hAnsiTheme="majorHAnsi" w:cstheme="majorBidi"/>
       <w:b/>
@@ -2762,7 +2747,6 @@
     <w:link w:val="Heading5"/>
     <w:uiPriority w:val="9"/>
     <w:semiHidden/>
-    <w:rsid w:val="00FC693F"/>
     <w:rPr>
       <w:rFonts w:asciiTheme="majorHAnsi" w:eastAsiaTheme="majorEastAsia" w:hAnsiTheme="majorHAnsi" w:cstheme="majorBidi"/>
       <w:color w:val="243F60" w:themeColor="accent1" w:themeShade="7F"/>
@@ -2774,7 +2758,6 @@
     <w:link w:val="Heading6"/>
     <w:uiPriority w:val="9"/>
     <w:semiHidden/>
-    <w:rsid w:val="00FC693F"/>
     <w:rPr>
       <w:rFonts w:asciiTheme="majorHAnsi" w:eastAsiaTheme="majorEastAsia" w:hAnsiTheme="majorHAnsi" w:cstheme="majorBidi"/>
       <w:i/>
@@ -2788,7 +2771,6 @@
     <w:link w:val="Heading7"/>
     <w:uiPriority w:val="9"/>
     <w:semiHidden/>
-    <w:rsid w:val="00FC693F"/>
     <w:rPr>
       <w:rFonts w:asciiTheme="majorHAnsi" w:eastAsiaTheme="majorEastAsia" w:hAnsiTheme="majorHAnsi" w:cstheme="majorBidi"/>
       <w:i/>
@@ -2802,7 +2784,6 @@
     <w:link w:val="Heading8"/>
     <w:uiPriority w:val="9"/>
     <w:semiHidden/>
-    <w:rsid w:val="00FC693F"/>
     <w:rPr>
       <w:rFonts w:asciiTheme="majorHAnsi" w:eastAsiaTheme="majorEastAsia" w:hAnsiTheme="majorHAnsi" w:cstheme="majorBidi"/>
       <w:color w:val="4F81BD" w:themeColor="accent1"/>
@@ -2816,7 +2797,6 @@
     <w:link w:val="Heading9"/>
     <w:uiPriority w:val="9"/>
     <w:semiHidden/>
-    <w:rsid w:val="00FC693F"/>
     <w:rPr>
       <w:rFonts w:asciiTheme="majorHAnsi" w:eastAsiaTheme="majorEastAsia" w:hAnsiTheme="majorHAnsi" w:cstheme="majorBidi"/>
       <w:i/>
@@ -2834,7 +2814,6 @@
     <w:semiHidden/>
     <w:unhideWhenUsed/>
     <w:qFormat/>
-    <w:rsid w:val="00FC693F"/>
     <w:pPr>
       <w:spacing w:line="240" w:lineRule="auto"/>
     </w:pPr>
@@ -2851,7 +2830,6 @@
     <w:basedOn w:val="DefaultParagraphFont"/>
     <w:uiPriority w:val="22"/>
     <w:qFormat/>
-    <w:rsid w:val="00FC693F"/>
     <w:rPr>
       <w:b/>
       <w:bCs/>
@@ -2862,7 +2840,6 @@
     <w:basedOn w:val="DefaultParagraphFont"/>
     <w:uiPriority w:val="20"/>
     <w:qFormat/>
-    <w:rsid w:val="00FC693F"/>
     <w:rPr>
       <w:i/>
       <w:iCs/>
@@ -2875,7 +2852,6 @@
     <w:link w:val="IntenseQuoteChar"/>
     <w:uiPriority w:val="30"/>
     <w:qFormat/>
-    <w:rsid w:val="00FC693F"/>
     <w:pPr>
       <w:pBdr>
         <w:bottom w:val="single" w:sz="4" w:space="4" w:color="4F81BD" w:themeColor="accent1"/>
@@ -2896,7 +2872,6 @@
     <w:basedOn w:val="DefaultParagraphFont"/>
     <w:link w:val="IntenseQuote"/>
     <w:uiPriority w:val="30"/>
-    <w:rsid w:val="00FC693F"/>
     <w:rPr>
       <w:b/>
       <w:bCs/>
@@ -2910,7 +2885,6 @@
     <w:basedOn w:val="DefaultParagraphFont"/>
     <w:uiPriority w:val="19"/>
     <w:qFormat/>
-    <w:rsid w:val="00FC693F"/>
     <w:rPr>
       <w:i/>
       <w:iCs/>
@@ -2922,7 +2896,6 @@
     <w:basedOn w:val="DefaultParagraphFont"/>
     <w:uiPriority w:val="21"/>
     <w:qFormat/>
-    <w:rsid w:val="00FC693F"/>
     <w:rPr>
       <w:b/>
       <w:bCs/>
@@ -2936,7 +2909,6 @@
     <w:basedOn w:val="DefaultParagraphFont"/>
     <w:uiPriority w:val="31"/>
     <w:qFormat/>
-    <w:rsid w:val="00FC693F"/>
     <w:rPr>
       <w:smallCaps/>
       <w:color w:val="C0504D" w:themeColor="accent2"/>
@@ -2948,7 +2920,6 @@
     <w:basedOn w:val="DefaultParagraphFont"/>
     <w:uiPriority w:val="32"/>
     <w:qFormat/>
-    <w:rsid w:val="00FC693F"/>
     <w:rPr>
       <w:b/>
       <w:bCs/>
@@ -2963,7 +2934,6 @@
     <w:basedOn w:val="DefaultParagraphFont"/>
     <w:uiPriority w:val="33"/>
     <w:qFormat/>
-    <w:rsid w:val="00FC693F"/>
     <w:rPr>
       <w:b/>
       <w:bCs/>
@@ -2979,7 +2949,6 @@
     <w:semiHidden/>
     <w:unhideWhenUsed/>
     <w:qFormat/>
-    <w:rsid w:val="00FC693F"/>
     <w:pPr>
       <w:outlineLvl w:val="9"/>
     </w:pPr>
@@ -2988,7 +2957,6 @@
     <w:name w:val="Table Grid"/>
     <w:basedOn w:val="TableNormal"/>
     <w:uiPriority w:val="59"/>
-    <w:rsid w:val="00FC693F"/>
     <w:pPr>
       <w:spacing w:after="0" w:line="240" w:lineRule="auto"/>
     </w:pPr>
@@ -3014,7 +2982,6 @@
     <w:name w:val="Light Shading"/>
     <w:basedOn w:val="TableNormal"/>
     <w:uiPriority w:val="60"/>
-    <w:rsid w:val="00FC693F"/>
     <w:pPr>
       <w:spacing w:after="0" w:line="240" w:lineRule="auto"/>
     </w:pPr>
@@ -3117,7 +3084,6 @@
     <w:name w:val="Light Shading Accent 1"/>
     <w:basedOn w:val="TableNormal"/>
     <w:uiPriority w:val="60"/>
-    <w:rsid w:val="00FC693F"/>
     <w:pPr>
       <w:spacing w:after="0" w:line="240" w:lineRule="auto"/>
     </w:pPr>
@@ -3220,7 +3186,6 @@
     <w:name w:val="Light Shading Accent 2"/>
     <w:basedOn w:val="TableNormal"/>
     <w:uiPriority w:val="60"/>
-    <w:rsid w:val="00FC693F"/>
     <w:pPr>
       <w:spacing w:after="0" w:line="240" w:lineRule="auto"/>
     </w:pPr>
@@ -3323,7 +3288,6 @@
     <w:name w:val="Light Shading Accent 3"/>
     <w:basedOn w:val="TableNormal"/>
     <w:uiPriority w:val="60"/>
-    <w:rsid w:val="00FC693F"/>
     <w:pPr>
       <w:spacing w:after="0" w:line="240" w:lineRule="auto"/>
     </w:pPr>
@@ -3426,7 +3390,6 @@
     <w:name w:val="Light Shading Accent 4"/>
     <w:basedOn w:val="TableNormal"/>
     <w:uiPriority w:val="60"/>
-    <w:rsid w:val="00FC693F"/>
     <w:pPr>
       <w:spacing w:after="0" w:line="240" w:lineRule="auto"/>
     </w:pPr>
@@ -3529,7 +3492,6 @@
     <w:name w:val="Light Shading Accent 5"/>
     <w:basedOn w:val="TableNormal"/>
     <w:uiPriority w:val="60"/>
-    <w:rsid w:val="00FC693F"/>
     <w:pPr>
       <w:spacing w:after="0" w:line="240" w:lineRule="auto"/>
     </w:pPr>
@@ -3632,7 +3594,6 @@
     <w:name w:val="Light Shading Accent 6"/>
     <w:basedOn w:val="TableNormal"/>
     <w:uiPriority w:val="60"/>
-    <w:rsid w:val="00FC693F"/>
     <w:pPr>
       <w:spacing w:after="0" w:line="240" w:lineRule="auto"/>
     </w:pPr>
@@ -3735,7 +3696,6 @@
     <w:name w:val="Light List"/>
     <w:basedOn w:val="TableNormal"/>
     <w:uiPriority w:val="61"/>
-    <w:rsid w:val="00FC693F"/>
     <w:pPr>
       <w:spacing w:after="0" w:line="240" w:lineRule="auto"/>
     </w:pPr>
@@ -3827,7 +3787,6 @@
     <w:name w:val="Light List Accent 1"/>
     <w:basedOn w:val="TableNormal"/>
     <w:uiPriority w:val="61"/>
-    <w:rsid w:val="00FC693F"/>
     <w:pPr>
       <w:spacing w:after="0" w:line="240" w:lineRule="auto"/>
     </w:pPr>
@@ -3919,7 +3878,6 @@
     <w:name w:val="Light List Accent 2"/>
     <w:basedOn w:val="TableNormal"/>
     <w:uiPriority w:val="61"/>
-    <w:rsid w:val="00CB0664"/>
     <w:pPr>
       <w:spacing w:after="0" w:line="240" w:lineRule="auto"/>
     </w:pPr>
@@ -4011,7 +3969,6 @@
     <w:name w:val="Light List Accent 3"/>
     <w:basedOn w:val="TableNormal"/>
     <w:uiPriority w:val="61"/>
-    <w:rsid w:val="00CB0664"/>
     <w:pPr>
       <w:spacing w:after="0" w:line="240" w:lineRule="auto"/>
     </w:pPr>
@@ -4103,7 +4060,6 @@
     <w:name w:val="Light List Accent 4"/>
     <w:basedOn w:val="TableNormal"/>
     <w:uiPriority w:val="61"/>
-    <w:rsid w:val="00CB0664"/>
     <w:pPr>
       <w:spacing w:after="0" w:line="240" w:lineRule="auto"/>
     </w:pPr>
@@ -4195,7 +4151,6 @@
     <w:name w:val="Light List Accent 5"/>
     <w:basedOn w:val="TableNormal"/>
     <w:uiPriority w:val="61"/>
-    <w:rsid w:val="00CB0664"/>
     <w:pPr>
       <w:spacing w:after="0" w:line="240" w:lineRule="auto"/>
     </w:pPr>
@@ -4287,7 +4242,6 @@
     <w:name w:val="Light List Accent 6"/>
     <w:basedOn w:val="TableNormal"/>
     <w:uiPriority w:val="61"/>
-    <w:rsid w:val="00CB0664"/>
     <w:pPr>
       <w:spacing w:after="0" w:line="240" w:lineRule="auto"/>
     </w:pPr>
@@ -4379,7 +4333,6 @@
     <w:name w:val="Light Grid"/>
     <w:basedOn w:val="TableNormal"/>
     <w:uiPriority w:val="62"/>
-    <w:rsid w:val="00CB0664"/>
     <w:pPr>
       <w:spacing w:after="0" w:line="240" w:lineRule="auto"/>
     </w:pPr>
@@ -4509,7 +4462,6 @@
     <w:name w:val="Light Grid Accent 1"/>
     <w:basedOn w:val="TableNormal"/>
     <w:uiPriority w:val="62"/>
-    <w:rsid w:val="00CB0664"/>
     <w:pPr>
       <w:spacing w:after="0" w:line="240" w:lineRule="auto"/>
     </w:pPr>
@@ -4639,7 +4591,6 @@
     <w:name w:val="Light Grid Accent 2"/>
     <w:basedOn w:val="TableNormal"/>
     <w:uiPriority w:val="62"/>
-    <w:rsid w:val="00CB0664"/>
     <w:pPr>
       <w:spacing w:after="0" w:line="240" w:lineRule="auto"/>
     </w:pPr>
@@ -4769,7 +4720,6 @@
     <w:name w:val="Light Grid Accent 3"/>
     <w:basedOn w:val="TableNormal"/>
     <w:uiPriority w:val="62"/>
-    <w:rsid w:val="00CB0664"/>
     <w:pPr>
       <w:spacing w:after="0" w:line="240" w:lineRule="auto"/>
     </w:pPr>
@@ -4899,7 +4849,6 @@
     <w:name w:val="Light Grid Accent 4"/>
     <w:basedOn w:val="TableNormal"/>
     <w:uiPriority w:val="62"/>
-    <w:rsid w:val="00CB0664"/>
     <w:pPr>
       <w:spacing w:after="0" w:line="240" w:lineRule="auto"/>
     </w:pPr>
@@ -5029,7 +4978,6 @@
     <w:name w:val="Light Grid Accent 5"/>
     <w:basedOn w:val="TableNormal"/>
     <w:uiPriority w:val="62"/>
-    <w:rsid w:val="00CB0664"/>
     <w:pPr>
       <w:spacing w:after="0" w:line="240" w:lineRule="auto"/>
     </w:pPr>
@@ -5159,7 +5107,6 @@
     <w:name w:val="Light Grid Accent 6"/>
     <w:basedOn w:val="TableNormal"/>
     <w:uiPriority w:val="62"/>
-    <w:rsid w:val="00CB0664"/>
     <w:pPr>
       <w:spacing w:after="0" w:line="240" w:lineRule="auto"/>
     </w:pPr>
@@ -5289,7 +5236,6 @@
     <w:name w:val="Medium Shading 1"/>
     <w:basedOn w:val="TableNormal"/>
     <w:uiPriority w:val="63"/>
-    <w:rsid w:val="00CB0664"/>
     <w:pPr>
       <w:spacing w:after="0" w:line="240" w:lineRule="auto"/>
     </w:pPr>
@@ -5395,7 +5341,6 @@
     <w:name w:val="Medium Shading 1 Accent 1"/>
     <w:basedOn w:val="TableNormal"/>
     <w:uiPriority w:val="63"/>
-    <w:rsid w:val="00CB0664"/>
     <w:pPr>
       <w:spacing w:after="0" w:line="240" w:lineRule="auto"/>
     </w:pPr>
@@ -5501,7 +5446,6 @@
     <w:name w:val="Medium Shading 1 Accent 2"/>
     <w:basedOn w:val="TableNormal"/>
     <w:uiPriority w:val="63"/>
-    <w:rsid w:val="00CB0664"/>
     <w:pPr>
       <w:spacing w:after="0" w:line="240" w:lineRule="auto"/>
     </w:pPr>
@@ -5607,7 +5551,6 @@
     <w:name w:val="Medium Shading 1 Accent 3"/>
     <w:basedOn w:val="TableNormal"/>
     <w:uiPriority w:val="63"/>
-    <w:rsid w:val="00CB0664"/>
     <w:pPr>
       <w:spacing w:after="0" w:line="240" w:lineRule="auto"/>
     </w:pPr>
@@ -5713,7 +5656,6 @@
     <w:name w:val="Medium Shading 1 Accent 4"/>
     <w:basedOn w:val="TableNormal"/>
     <w:uiPriority w:val="63"/>
-    <w:rsid w:val="00CB0664"/>
     <w:pPr>
       <w:spacing w:after="0" w:line="240" w:lineRule="auto"/>
     </w:pPr>
@@ -5819,7 +5761,6 @@
     <w:name w:val="Medium Shading 1 Accent 5"/>
     <w:basedOn w:val="TableNormal"/>
     <w:uiPriority w:val="63"/>
-    <w:rsid w:val="00CB0664"/>
     <w:pPr>
       <w:spacing w:after="0" w:line="240" w:lineRule="auto"/>
     </w:pPr>
@@ -5925,7 +5866,6 @@
     <w:name w:val="Medium Shading 1 Accent 6"/>
     <w:basedOn w:val="TableNormal"/>
     <w:uiPriority w:val="63"/>
-    <w:rsid w:val="00CB0664"/>
     <w:pPr>
       <w:spacing w:after="0" w:line="240" w:lineRule="auto"/>
     </w:pPr>
@@ -6031,7 +5971,6 @@
     <w:name w:val="Medium Shading 2"/>
     <w:basedOn w:val="TableNormal"/>
     <w:uiPriority w:val="64"/>
-    <w:rsid w:val="00CB0664"/>
     <w:pPr>
       <w:spacing w:after="0" w:line="240" w:lineRule="auto"/>
     </w:pPr>
@@ -6180,7 +6119,6 @@
     <w:name w:val="Medium Shading 2 Accent 1"/>
     <w:basedOn w:val="TableNormal"/>
     <w:uiPriority w:val="64"/>
-    <w:rsid w:val="00CB0664"/>
     <w:pPr>
       <w:spacing w:after="0" w:line="240" w:lineRule="auto"/>
     </w:pPr>
@@ -6329,7 +6267,6 @@
     <w:name w:val="Medium Shading 2 Accent 2"/>
     <w:basedOn w:val="TableNormal"/>
     <w:uiPriority w:val="64"/>
-    <w:rsid w:val="00CB0664"/>
     <w:pPr>
       <w:spacing w:after="0" w:line="240" w:lineRule="auto"/>
     </w:pPr>
@@ -6478,7 +6415,6 @@
     <w:name w:val="Medium Shading 2 Accent 3"/>
     <w:basedOn w:val="TableNormal"/>
     <w:uiPriority w:val="64"/>
-    <w:rsid w:val="00CB0664"/>
     <w:pPr>
       <w:spacing w:after="0" w:line="240" w:lineRule="auto"/>
     </w:pPr>
@@ -6627,7 +6563,6 @@
     <w:name w:val="Medium Shading 2 Accent 4"/>
     <w:basedOn w:val="TableNormal"/>
     <w:uiPriority w:val="64"/>
-    <w:rsid w:val="00CB0664"/>
     <w:pPr>
       <w:spacing w:after="0" w:line="240" w:lineRule="auto"/>
     </w:pPr>
@@ -6776,7 +6711,6 @@
     <w:name w:val="Medium Shading 2 Accent 5"/>
     <w:basedOn w:val="TableNormal"/>
     <w:uiPriority w:val="64"/>
-    <w:rsid w:val="00CB0664"/>
     <w:pPr>
       <w:spacing w:after="0" w:line="240" w:lineRule="auto"/>
     </w:pPr>
@@ -6925,7 +6859,6 @@
     <w:name w:val="Medium Shading 2 Accent 6"/>
     <w:basedOn w:val="TableNormal"/>
     <w:uiPriority w:val="64"/>
-    <w:rsid w:val="00CB0664"/>
     <w:pPr>
       <w:spacing w:after="0" w:line="240" w:lineRule="auto"/>
     </w:pPr>
@@ -7074,7 +7007,6 @@
     <w:name w:val="Medium List 1"/>
     <w:basedOn w:val="TableNormal"/>
     <w:uiPriority w:val="65"/>
-    <w:rsid w:val="00CB0664"/>
     <w:pPr>
       <w:spacing w:after="0" w:line="240" w:lineRule="auto"/>
     </w:pPr>
@@ -7158,7 +7090,6 @@
     <w:name w:val="Medium List 1 Accent 1"/>
     <w:basedOn w:val="TableNormal"/>
     <w:uiPriority w:val="65"/>
-    <w:rsid w:val="00CB0664"/>
     <w:pPr>
       <w:spacing w:after="0" w:line="240" w:lineRule="auto"/>
     </w:pPr>
@@ -7242,7 +7173,6 @@
     <w:name w:val="Medium List 1 Accent 2"/>
     <w:basedOn w:val="TableNormal"/>
     <w:uiPriority w:val="65"/>
-    <w:rsid w:val="00CB0664"/>
     <w:pPr>
       <w:spacing w:after="0" w:line="240" w:lineRule="auto"/>
     </w:pPr>
@@ -7326,7 +7256,6 @@
     <w:name w:val="Medium List 1 Accent 3"/>
     <w:basedOn w:val="TableNormal"/>
     <w:uiPriority w:val="65"/>
-    <w:rsid w:val="00CB0664"/>
     <w:pPr>
       <w:spacing w:after="0" w:line="240" w:lineRule="auto"/>
     </w:pPr>
@@ -7410,7 +7339,6 @@
     <w:name w:val="Medium List 1 Accent 4"/>
     <w:basedOn w:val="TableNormal"/>
     <w:uiPriority w:val="65"/>
-    <w:rsid w:val="00CB0664"/>
     <w:pPr>
       <w:spacing w:after="0" w:line="240" w:lineRule="auto"/>
     </w:pPr>
@@ -7494,7 +7422,6 @@
     <w:name w:val="Medium List 1 Accent 5"/>
     <w:basedOn w:val="TableNormal"/>
     <w:uiPriority w:val="65"/>
-    <w:rsid w:val="00CB0664"/>
     <w:pPr>
       <w:spacing w:after="0" w:line="240" w:lineRule="auto"/>
     </w:pPr>
@@ -7578,7 +7505,6 @@
     <w:name w:val="Medium List 1 Accent 6"/>
     <w:basedOn w:val="TableNormal"/>
     <w:uiPriority w:val="65"/>
-    <w:rsid w:val="00CB0664"/>
     <w:pPr>
       <w:spacing w:after="0" w:line="240" w:lineRule="auto"/>
     </w:pPr>
@@ -7662,7 +7588,6 @@
     <w:name w:val="Medium List 2"/>
     <w:basedOn w:val="TableNormal"/>
     <w:uiPriority w:val="66"/>
-    <w:rsid w:val="00CB0664"/>
     <w:pPr>
       <w:spacing w:after="0" w:line="240" w:lineRule="auto"/>
     </w:pPr>
@@ -7790,7 +7715,6 @@
     <w:name w:val="Medium List 2 Accent 1"/>
     <w:basedOn w:val="TableNormal"/>
     <w:uiPriority w:val="66"/>
-    <w:rsid w:val="00CB0664"/>
     <w:pPr>
       <w:spacing w:after="0" w:line="240" w:lineRule="auto"/>
     </w:pPr>
@@ -7918,7 +7842,6 @@
     <w:name w:val="Medium List 2 Accent 2"/>
     <w:basedOn w:val="TableNormal"/>
     <w:uiPriority w:val="66"/>
-    <w:rsid w:val="00CB0664"/>
     <w:pPr>
       <w:spacing w:after="0" w:line="240" w:lineRule="auto"/>
     </w:pPr>
@@ -8046,7 +7969,6 @@
     <w:name w:val="Medium List 2 Accent 3"/>
     <w:basedOn w:val="TableNormal"/>
     <w:uiPriority w:val="66"/>
-    <w:rsid w:val="00CB0664"/>
     <w:pPr>
       <w:spacing w:after="0" w:line="240" w:lineRule="auto"/>
     </w:pPr>
@@ -8174,7 +8096,6 @@
     <w:name w:val="Medium List 2 Accent 4"/>
     <w:basedOn w:val="TableNormal"/>
     <w:uiPriority w:val="66"/>
-    <w:rsid w:val="00CB0664"/>
     <w:pPr>
       <w:spacing w:after="0" w:line="240" w:lineRule="auto"/>
     </w:pPr>
@@ -8302,7 +8223,6 @@
     <w:name w:val="Medium List 2 Accent 5"/>
     <w:basedOn w:val="TableNormal"/>
     <w:uiPriority w:val="66"/>
-    <w:rsid w:val="00CB0664"/>
     <w:pPr>
       <w:spacing w:after="0" w:line="240" w:lineRule="auto"/>
     </w:pPr>
@@ -8430,7 +8350,6 @@
     <w:name w:val="Medium List 2 Accent 6"/>
     <w:basedOn w:val="TableNormal"/>
     <w:uiPriority w:val="66"/>
-    <w:rsid w:val="00CB0664"/>
     <w:pPr>
       <w:spacing w:after="0" w:line="240" w:lineRule="auto"/>
     </w:pPr>
@@ -8558,7 +8477,6 @@
     <w:name w:val="Medium Grid 1"/>
     <w:basedOn w:val="TableNormal"/>
     <w:uiPriority w:val="67"/>
-    <w:rsid w:val="00CB0664"/>
     <w:pPr>
       <w:spacing w:after="0" w:line="240" w:lineRule="auto"/>
     </w:pPr>
@@ -8631,7 +8549,6 @@
     <w:name w:val="Medium Grid 1 Accent 1"/>
     <w:basedOn w:val="TableNormal"/>
     <w:uiPriority w:val="67"/>
-    <w:rsid w:val="00CB0664"/>
     <w:pPr>
       <w:spacing w:after="0" w:line="240" w:lineRule="auto"/>
     </w:pPr>
@@ -8704,7 +8621,6 @@
     <w:name w:val="Medium Grid 1 Accent 2"/>
     <w:basedOn w:val="TableNormal"/>
     <w:uiPriority w:val="67"/>
-    <w:rsid w:val="00CB0664"/>
     <w:pPr>
       <w:spacing w:after="0" w:line="240" w:lineRule="auto"/>
     </w:pPr>
@@ -8777,7 +8693,6 @@
     <w:name w:val="Medium Grid 1 Accent 3"/>
     <w:basedOn w:val="TableNormal"/>
     <w:uiPriority w:val="67"/>
-    <w:rsid w:val="00CB0664"/>
     <w:pPr>
       <w:spacing w:after="0" w:line="240" w:lineRule="auto"/>
     </w:pPr>
@@ -8850,7 +8765,6 @@
     <w:name w:val="Medium Grid 1 Accent 4"/>
     <w:basedOn w:val="TableNormal"/>
     <w:uiPriority w:val="67"/>
-    <w:rsid w:val="00CB0664"/>
     <w:pPr>
       <w:spacing w:after="0" w:line="240" w:lineRule="auto"/>
     </w:pPr>
@@ -8923,7 +8837,6 @@
     <w:name w:val="Medium Grid 1 Accent 5"/>
     <w:basedOn w:val="TableNormal"/>
     <w:uiPriority w:val="67"/>
-    <w:rsid w:val="00CB0664"/>
     <w:pPr>
       <w:spacing w:after="0" w:line="240" w:lineRule="auto"/>
     </w:pPr>
@@ -8996,7 +8909,6 @@
     <w:name w:val="Medium Grid 1 Accent 6"/>
     <w:basedOn w:val="TableNormal"/>
     <w:uiPriority w:val="67"/>
-    <w:rsid w:val="00CB0664"/>
     <w:pPr>
       <w:spacing w:after="0" w:line="240" w:lineRule="auto"/>
     </w:pPr>
@@ -9069,7 +8981,6 @@
     <w:name w:val="Medium Grid 2"/>
     <w:basedOn w:val="TableNormal"/>
     <w:uiPriority w:val="68"/>
-    <w:rsid w:val="00CB0664"/>
     <w:pPr>
       <w:spacing w:after="0" w:line="240" w:lineRule="auto"/>
     </w:pPr>
@@ -9194,7 +9105,6 @@
     <w:name w:val="Medium Grid 2 Accent 1"/>
     <w:basedOn w:val="TableNormal"/>
     <w:uiPriority w:val="68"/>
-    <w:rsid w:val="00CB0664"/>
     <w:pPr>
       <w:spacing w:after="0" w:line="240" w:lineRule="auto"/>
     </w:pPr>
@@ -9319,7 +9229,6 @@
     <w:name w:val="Medium Grid 2 Accent 2"/>
     <w:basedOn w:val="TableNormal"/>
     <w:uiPriority w:val="68"/>
-    <w:rsid w:val="00CB0664"/>
     <w:pPr>
       <w:spacing w:after="0" w:line="240" w:lineRule="auto"/>
     </w:pPr>
@@ -9444,7 +9353,6 @@
     <w:name w:val="Medium Grid 2 Accent 3"/>
     <w:basedOn w:val="TableNormal"/>
     <w:uiPriority w:val="68"/>
-    <w:rsid w:val="00CB0664"/>
     <w:pPr>
       <w:spacing w:after="0" w:line="240" w:lineRule="auto"/>
     </w:pPr>
@@ -9569,7 +9477,6 @@
     <w:name w:val="Medium Grid 2 Accent 4"/>
     <w:basedOn w:val="TableNormal"/>
     <w:uiPriority w:val="68"/>
-    <w:rsid w:val="00CB0664"/>
     <w:pPr>
       <w:spacing w:after="0" w:line="240" w:lineRule="auto"/>
     </w:pPr>
@@ -9694,7 +9601,6 @@
     <w:name w:val="Medium Grid 2 Accent 5"/>
     <w:basedOn w:val="TableNormal"/>
     <w:uiPriority w:val="68"/>
-    <w:rsid w:val="00CB0664"/>
     <w:pPr>
       <w:spacing w:after="0" w:line="240" w:lineRule="auto"/>
     </w:pPr>
@@ -9819,7 +9725,6 @@
     <w:name w:val="Medium Grid 2 Accent 6"/>
     <w:basedOn w:val="TableNormal"/>
     <w:uiPriority w:val="68"/>
-    <w:rsid w:val="00CB0664"/>
     <w:pPr>
       <w:spacing w:after="0" w:line="240" w:lineRule="auto"/>
     </w:pPr>
@@ -9944,7 +9849,6 @@
     <w:name w:val="Medium Grid 3"/>
     <w:basedOn w:val="TableNormal"/>
     <w:uiPriority w:val="69"/>
-    <w:rsid w:val="00CB0664"/>
     <w:pPr>
       <w:spacing w:after="0" w:line="240" w:lineRule="auto"/>
     </w:pPr>
@@ -10085,7 +9989,6 @@
     <w:name w:val="Medium Grid 3 Accent 1"/>
     <w:basedOn w:val="TableNormal"/>
     <w:uiPriority w:val="69"/>
-    <w:rsid w:val="00CB0664"/>
     <w:pPr>
       <w:spacing w:after="0" w:line="240" w:lineRule="auto"/>
     </w:pPr>
@@ -10226,7 +10129,6 @@
     <w:name w:val="Medium Grid 3 Accent 2"/>
     <w:basedOn w:val="TableNormal"/>
     <w:uiPriority w:val="69"/>
-    <w:rsid w:val="00CB0664"/>
     <w:pPr>
       <w:spacing w:after="0" w:line="240" w:lineRule="auto"/>
     </w:pPr>
@@ -10367,7 +10269,6 @@
     <w:name w:val="Medium Grid 3 Accent 3"/>
     <w:basedOn w:val="TableNormal"/>
     <w:uiPriority w:val="69"/>
-    <w:rsid w:val="00CB0664"/>
     <w:pPr>
       <w:spacing w:after="0" w:line="240" w:lineRule="auto"/>
     </w:pPr>
@@ -10508,7 +10409,6 @@
     <w:name w:val="Medium Grid 3 Accent 4"/>
     <w:basedOn w:val="TableNormal"/>
     <w:uiPriority w:val="69"/>
-    <w:rsid w:val="00CB0664"/>
     <w:pPr>
       <w:spacing w:after="0" w:line="240" w:lineRule="auto"/>
     </w:pPr>
@@ -10649,7 +10549,6 @@
     <w:name w:val="Medium Grid 3 Accent 5"/>
     <w:basedOn w:val="TableNormal"/>
     <w:uiPriority w:val="69"/>
-    <w:rsid w:val="00CB0664"/>
     <w:pPr>
       <w:spacing w:after="0" w:line="240" w:lineRule="auto"/>
     </w:pPr>
@@ -10790,7 +10689,6 @@
     <w:name w:val="Medium Grid 3 Accent 6"/>
     <w:basedOn w:val="TableNormal"/>
     <w:uiPriority w:val="69"/>
-    <w:rsid w:val="00CB0664"/>
     <w:pPr>
       <w:spacing w:after="0" w:line="240" w:lineRule="auto"/>
     </w:pPr>
@@ -10931,7 +10829,6 @@
     <w:name w:val="Dark List"/>
     <w:basedOn w:val="TableNormal"/>
     <w:uiPriority w:val="70"/>
-    <w:rsid w:val="00CB0664"/>
     <w:pPr>
       <w:spacing w:after="0" w:line="240" w:lineRule="auto"/>
     </w:pPr>
@@ -11045,7 +10942,6 @@
     <w:name w:val="Dark List Accent 1"/>
     <w:basedOn w:val="TableNormal"/>
     <w:uiPriority w:val="70"/>
-    <w:rsid w:val="00CB0664"/>
     <w:pPr>
       <w:spacing w:after="0" w:line="240" w:lineRule="auto"/>
     </w:pPr>
@@ -11159,7 +11055,6 @@
     <w:name w:val="Dark List Accent 2"/>
     <w:basedOn w:val="TableNormal"/>
     <w:uiPriority w:val="70"/>
-    <w:rsid w:val="00CB0664"/>
     <w:pPr>
       <w:spacing w:after="0" w:line="240" w:lineRule="auto"/>
     </w:pPr>
@@ -11273,7 +11168,6 @@
     <w:name w:val="Dark List Accent 3"/>
     <w:basedOn w:val="TableNormal"/>
     <w:uiPriority w:val="70"/>
-    <w:rsid w:val="00CB0664"/>
     <w:pPr>
       <w:spacing w:after="0" w:line="240" w:lineRule="auto"/>
     </w:pPr>
@@ -11387,7 +11281,6 @@
     <w:name w:val="Dark List Accent 4"/>
     <w:basedOn w:val="TableNormal"/>
     <w:uiPriority w:val="70"/>
-    <w:rsid w:val="00CB0664"/>
     <w:pPr>
       <w:spacing w:after="0" w:line="240" w:lineRule="auto"/>
     </w:pPr>
@@ -11501,7 +11394,6 @@
     <w:name w:val="Dark List Accent 5"/>
     <w:basedOn w:val="TableNormal"/>
     <w:uiPriority w:val="70"/>
-    <w:rsid w:val="00CB0664"/>
     <w:pPr>
       <w:spacing w:after="0" w:line="240" w:lineRule="auto"/>
     </w:pPr>
@@ -11615,7 +11507,6 @@
     <w:name w:val="Dark List Accent 6"/>
     <w:basedOn w:val="TableNormal"/>
     <w:uiPriority w:val="70"/>
-    <w:rsid w:val="00CB0664"/>
     <w:pPr>
       <w:spacing w:after="0" w:line="240" w:lineRule="auto"/>
     </w:pPr>
@@ -11729,7 +11620,6 @@
     <w:name w:val="Colorful Shading"/>
     <w:basedOn w:val="TableNormal"/>
     <w:uiPriority w:val="71"/>
-    <w:rsid w:val="00CB0664"/>
     <w:pPr>
       <w:spacing w:after="0" w:line="240" w:lineRule="auto"/>
     </w:pPr>
@@ -11851,7 +11741,6 @@
     <w:name w:val="Colorful Shading Accent 1"/>
     <w:basedOn w:val="TableNormal"/>
     <w:uiPriority w:val="71"/>
-    <w:rsid w:val="00CB0664"/>
     <w:pPr>
       <w:spacing w:after="0" w:line="240" w:lineRule="auto"/>
     </w:pPr>
@@ -11973,7 +11862,6 @@
     <w:name w:val="Colorful Shading Accent 2"/>
     <w:basedOn w:val="TableNormal"/>
     <w:uiPriority w:val="71"/>
-    <w:rsid w:val="00CB0664"/>
     <w:pPr>
       <w:spacing w:after="0" w:line="240" w:lineRule="auto"/>
     </w:pPr>
@@ -12095,7 +11983,6 @@
     <w:name w:val="Colorful Shading Accent 3"/>
     <w:basedOn w:val="TableNormal"/>
     <w:uiPriority w:val="71"/>
-    <w:rsid w:val="00CB0664"/>
     <w:pPr>
       <w:spacing w:after="0" w:line="240" w:lineRule="auto"/>
     </w:pPr>
@@ -12207,7 +12094,6 @@
     <w:name w:val="Colorful Shading Accent 4"/>
     <w:basedOn w:val="TableNormal"/>
     <w:uiPriority w:val="71"/>
-    <w:rsid w:val="00CB0664"/>
     <w:pPr>
       <w:spacing w:after="0" w:line="240" w:lineRule="auto"/>
     </w:pPr>
@@ -12329,7 +12215,6 @@
     <w:name w:val="Colorful Shading Accent 5"/>
     <w:basedOn w:val="TableNormal"/>
     <w:uiPriority w:val="71"/>
-    <w:rsid w:val="00CB0664"/>
     <w:pPr>
       <w:spacing w:after="0" w:line="240" w:lineRule="auto"/>
     </w:pPr>
@@ -12451,7 +12336,6 @@
     <w:name w:val="Colorful Shading Accent 6"/>
     <w:basedOn w:val="TableNormal"/>
     <w:uiPriority w:val="71"/>
-    <w:rsid w:val="00CB0664"/>
     <w:pPr>
       <w:spacing w:after="0" w:line="240" w:lineRule="auto"/>
     </w:pPr>
@@ -12573,7 +12457,6 @@
     <w:name w:val="Colorful List"/>
     <w:basedOn w:val="TableNormal"/>
     <w:uiPriority w:val="72"/>
-    <w:rsid w:val="00CB0664"/>
     <w:pPr>
       <w:spacing w:after="0" w:line="240" w:lineRule="auto"/>
     </w:pPr>
@@ -12659,7 +12542,6 @@
     <w:name w:val="Colorful List Accent 1"/>
     <w:basedOn w:val="TableNormal"/>
     <w:uiPriority w:val="72"/>
-    <w:rsid w:val="00CB0664"/>
     <w:pPr>
       <w:spacing w:after="0" w:line="240" w:lineRule="auto"/>
     </w:pPr>
@@ -12745,7 +12627,6 @@
     <w:name w:val="Colorful List Accent 2"/>
     <w:basedOn w:val="TableNormal"/>
     <w:uiPriority w:val="72"/>
-    <w:rsid w:val="00CB0664"/>
     <w:pPr>
       <w:spacing w:after="0" w:line="240" w:lineRule="auto"/>
     </w:pPr>
@@ -12831,7 +12712,6 @@
     <w:name w:val="Colorful List Accent 3"/>
     <w:basedOn w:val="TableNormal"/>
     <w:uiPriority w:val="72"/>
-    <w:rsid w:val="00CB0664"/>
     <w:pPr>
       <w:spacing w:after="0" w:line="240" w:lineRule="auto"/>
     </w:pPr>
@@ -12917,7 +12797,6 @@
     <w:name w:val="Colorful List Accent 4"/>
     <w:basedOn w:val="TableNormal"/>
     <w:uiPriority w:val="72"/>
-    <w:rsid w:val="00CB0664"/>
     <w:pPr>
       <w:spacing w:after="0" w:line="240" w:lineRule="auto"/>
     </w:pPr>
@@ -13003,7 +12882,6 @@
     <w:name w:val="Colorful List Accent 5"/>
     <w:basedOn w:val="TableNormal"/>
     <w:uiPriority w:val="72"/>
-    <w:rsid w:val="00CB0664"/>
     <w:pPr>
       <w:spacing w:after="0" w:line="240" w:lineRule="auto"/>
     </w:pPr>
@@ -13089,7 +12967,6 @@
     <w:name w:val="Colorful List Accent 6"/>
     <w:basedOn w:val="TableNormal"/>
     <w:uiPriority w:val="72"/>
-    <w:rsid w:val="00CB0664"/>
     <w:pPr>
       <w:spacing w:after="0" w:line="240" w:lineRule="auto"/>
     </w:pPr>
@@ -13175,7 +13052,6 @@
     <w:name w:val="Colorful Grid"/>
     <w:basedOn w:val="TableNormal"/>
     <w:uiPriority w:val="73"/>
-    <w:rsid w:val="00CB0664"/>
     <w:pPr>
       <w:spacing w:after="0" w:line="240" w:lineRule="auto"/>
     </w:pPr>
@@ -13255,7 +13131,6 @@
     <w:name w:val="Colorful Grid Accent 1"/>
     <w:basedOn w:val="TableNormal"/>
     <w:uiPriority w:val="73"/>
-    <w:rsid w:val="00CB0664"/>
     <w:pPr>
       <w:spacing w:after="0" w:line="240" w:lineRule="auto"/>
     </w:pPr>
@@ -13335,7 +13210,6 @@
     <w:name w:val="Colorful Grid Accent 2"/>
     <w:basedOn w:val="TableNormal"/>
     <w:uiPriority w:val="73"/>
-    <w:rsid w:val="00CB0664"/>
     <w:pPr>
       <w:spacing w:after="0" w:line="240" w:lineRule="auto"/>
     </w:pPr>
@@ -13415,7 +13289,6 @@
     <w:name w:val="Colorful Grid Accent 3"/>
     <w:basedOn w:val="TableNormal"/>
     <w:uiPriority w:val="73"/>
-    <w:rsid w:val="00CB0664"/>
     <w:pPr>
       <w:spacing w:after="0" w:line="240" w:lineRule="auto"/>
     </w:pPr>
@@ -13495,7 +13368,6 @@
     <w:name w:val="Colorful Grid Accent 4"/>
     <w:basedOn w:val="TableNormal"/>
     <w:uiPriority w:val="73"/>
-    <w:rsid w:val="00CB0664"/>
     <w:pPr>
       <w:spacing w:after="0" w:line="240" w:lineRule="auto"/>
     </w:pPr>
@@ -13575,7 +13447,6 @@
     <w:name w:val="Colorful Grid Accent 5"/>
     <w:basedOn w:val="TableNormal"/>
     <w:uiPriority w:val="73"/>
-    <w:rsid w:val="00CB0664"/>
     <w:pPr>
       <w:spacing w:after="0" w:line="240" w:lineRule="auto"/>
     </w:pPr>
@@ -13655,7 +13526,6 @@
     <w:name w:val="Colorful Grid Accent 6"/>
     <w:basedOn w:val="TableNormal"/>
     <w:uiPriority w:val="73"/>
-    <w:rsid w:val="00CB0664"/>
     <w:pPr>
       <w:spacing w:after="0" w:line="240" w:lineRule="auto"/>
     </w:pPr>
@@ -13920,7 +13790,6 @@
   <w:style w:type="paragraph" w:default="1" w:styleId="Normal">
     <w:name w:val="Normal"/>
     <w:qFormat/>
-    <w:rsid w:val="00FC693F"/>
   </w:style>
   <w:style w:type="paragraph" w:styleId="Heading1">
     <w:name w:val="heading 1"/>
@@ -13929,7 +13798,6 @@
     <w:link w:val="Heading1Char"/>
     <w:uiPriority w:val="9"/>
     <w:qFormat/>
-    <w:rsid w:val="00FC693F"/>
     <w:pPr>
       <w:keepNext/>
       <w:keepLines/>
@@ -13953,7 +13821,6 @@
     <w:uiPriority w:val="9"/>
     <w:unhideWhenUsed/>
     <w:qFormat/>
-    <w:rsid w:val="00FC693F"/>
     <w:pPr>
       <w:keepNext/>
       <w:keepLines/>
@@ -13977,7 +13844,6 @@
     <w:uiPriority w:val="9"/>
     <w:unhideWhenUsed/>
     <w:qFormat/>
-    <w:rsid w:val="00FC693F"/>
     <w:pPr>
       <w:keepNext/>
       <w:keepLines/>
@@ -14000,7 +13866,6 @@
     <w:semiHidden/>
     <w:unhideWhenUsed/>
     <w:qFormat/>
-    <w:rsid w:val="00FC693F"/>
     <w:pPr>
       <w:keepNext/>
       <w:keepLines/>
@@ -14025,7 +13890,6 @@
     <w:semiHidden/>
     <w:unhideWhenUsed/>
     <w:qFormat/>
-    <w:rsid w:val="00FC693F"/>
     <w:pPr>
       <w:keepNext/>
       <w:keepLines/>
@@ -14046,7 +13910,6 @@
     <w:semiHidden/>
     <w:unhideWhenUsed/>
     <w:qFormat/>
-    <w:rsid w:val="00FC693F"/>
     <w:pPr>
       <w:keepNext/>
       <w:keepLines/>
@@ -14069,7 +13932,6 @@
     <w:semiHidden/>
     <w:unhideWhenUsed/>
     <w:qFormat/>
-    <w:rsid w:val="00FC693F"/>
     <w:pPr>
       <w:keepNext/>
       <w:keepLines/>
@@ -14092,7 +13954,6 @@
     <w:semiHidden/>
     <w:unhideWhenUsed/>
     <w:qFormat/>
-    <w:rsid w:val="00FC693F"/>
     <w:pPr>
       <w:keepNext/>
       <w:keepLines/>
@@ -14115,7 +13976,6 @@
     <w:semiHidden/>
     <w:unhideWhenUsed/>
     <w:qFormat/>
-    <w:rsid w:val="00FC693F"/>
     <w:pPr>
       <w:keepNext/>
       <w:keepLines/>
@@ -14162,7 +14022,6 @@
     <w:name w:val="No Spacing"/>
     <w:uiPriority w:val="1"/>
     <w:qFormat/>
-    <w:rsid w:val="00FC693F"/>
     <w:pPr>
       <w:spacing w:after="0" w:line="240" w:lineRule="auto"/>
     </w:pPr>
@@ -14172,7 +14031,6 @@
     <w:basedOn w:val="DefaultParagraphFont"/>
     <w:link w:val="Heading1"/>
     <w:uiPriority w:val="9"/>
-    <w:rsid w:val="00FC693F"/>
     <w:rPr>
       <w:rFonts w:asciiTheme="majorHAnsi" w:eastAsiaTheme="majorEastAsia" w:hAnsiTheme="majorHAnsi" w:cstheme="majorBidi"/>
       <w:b/>
@@ -14187,7 +14045,6 @@
     <w:basedOn w:val="DefaultParagraphFont"/>
     <w:link w:val="Heading2"/>
     <w:uiPriority w:val="9"/>
-    <w:rsid w:val="00FC693F"/>
     <w:rPr>
       <w:rFonts w:asciiTheme="majorHAnsi" w:eastAsiaTheme="majorEastAsia" w:hAnsiTheme="majorHAnsi" w:cstheme="majorBidi"/>
       <w:b/>
@@ -14202,7 +14059,6 @@
     <w:basedOn w:val="DefaultParagraphFont"/>
     <w:link w:val="Heading3"/>
     <w:uiPriority w:val="9"/>
-    <w:rsid w:val="00FC693F"/>
     <w:rPr>
       <w:rFonts w:asciiTheme="majorHAnsi" w:eastAsiaTheme="majorEastAsia" w:hAnsiTheme="majorHAnsi" w:cstheme="majorBidi"/>
       <w:b/>
@@ -14217,7 +14073,6 @@
     <w:link w:val="TitleChar"/>
     <w:uiPriority w:val="10"/>
     <w:qFormat/>
-    <w:rsid w:val="00FC693F"/>
     <w:pPr>
       <w:pBdr>
         <w:bottom w:val="single" w:sz="8" w:space="4" w:color="4F81BD" w:themeColor="accent1"/>
@@ -14239,7 +14094,6 @@
     <w:basedOn w:val="DefaultParagraphFont"/>
     <w:link w:val="Title"/>
     <w:uiPriority w:val="10"/>
-    <w:rsid w:val="00FC693F"/>
     <w:rPr>
       <w:rFonts w:asciiTheme="majorHAnsi" w:eastAsiaTheme="majorEastAsia" w:hAnsiTheme="majorHAnsi" w:cstheme="majorBidi"/>
       <w:color w:val="17365D" w:themeColor="text2" w:themeShade="BF"/>
@@ -14256,7 +14110,6 @@
     <w:link w:val="SubtitleChar"/>
     <w:uiPriority w:val="11"/>
     <w:qFormat/>
-    <w:rsid w:val="00FC693F"/>
     <w:pPr>
       <w:numPr>
         <w:ilvl w:val="1"/>
@@ -14277,7 +14130,6 @@
     <w:basedOn w:val="DefaultParagraphFont"/>
     <w:link w:val="Subtitle"/>
     <w:uiPriority w:val="11"/>
-    <w:rsid w:val="00FC693F"/>
     <w:rPr>
       <w:rFonts w:asciiTheme="majorHAnsi" w:eastAsiaTheme="majorEastAsia" w:hAnsiTheme="majorHAnsi" w:cstheme="majorBidi"/>
       <w:i/>
@@ -14293,7 +14145,6 @@
     <w:basedOn w:val="Normal"/>
     <w:uiPriority w:val="34"/>
     <w:qFormat/>
-    <w:rsid w:val="00FC693F"/>
     <w:pPr>
       <w:ind w:left="720"/>
       <w:contextualSpacing/>
@@ -14305,7 +14156,6 @@
     <w:link w:val="BodyTextChar"/>
     <w:uiPriority w:val="99"/>
     <w:unhideWhenUsed/>
-    <w:rsid w:val="00AA1D8D"/>
     <w:pPr>
       <w:spacing w:after="120"/>
     </w:pPr>
@@ -14315,7 +14165,6 @@
     <w:basedOn w:val="DefaultParagraphFont"/>
     <w:link w:val="BodyText"/>
     <w:uiPriority w:val="99"/>
-    <w:rsid w:val="00AA1D8D"/>
   </w:style>
   <w:style w:type="paragraph" w:styleId="BodyText2">
     <w:name w:val="Body Text 2"/>
@@ -14323,7 +14172,6 @@
     <w:link w:val="BodyText2Char"/>
     <w:uiPriority w:val="99"/>
     <w:unhideWhenUsed/>
-    <w:rsid w:val="00AA1D8D"/>
     <w:pPr>
       <w:spacing w:after="120" w:line="480" w:lineRule="auto"/>
     </w:pPr>
@@ -14333,7 +14181,6 @@
     <w:basedOn w:val="DefaultParagraphFont"/>
     <w:link w:val="BodyText2"/>
     <w:uiPriority w:val="99"/>
-    <w:rsid w:val="00AA1D8D"/>
   </w:style>
   <w:style w:type="paragraph" w:styleId="BodyText3">
     <w:name w:val="Body Text 3"/>
@@ -14341,7 +14188,6 @@
     <w:link w:val="BodyText3Char"/>
     <w:uiPriority w:val="99"/>
     <w:unhideWhenUsed/>
-    <w:rsid w:val="00AA1D8D"/>
     <w:pPr>
       <w:spacing w:after="120"/>
     </w:pPr>
@@ -14355,7 +14201,6 @@
     <w:basedOn w:val="DefaultParagraphFont"/>
     <w:link w:val="BodyText3"/>
     <w:uiPriority w:val="99"/>
-    <w:rsid w:val="00AA1D8D"/>
     <w:rPr>
       <w:sz w:val="16"/>
       <w:szCs w:val="16"/>
@@ -14366,7 +14211,6 @@
     <w:basedOn w:val="Normal"/>
     <w:uiPriority w:val="99"/>
     <w:unhideWhenUsed/>
-    <w:rsid w:val="00AA1D8D"/>
     <w:pPr>
       <w:ind w:left="360" w:hanging="360"/>
       <w:contextualSpacing/>
@@ -14377,7 +14221,6 @@
     <w:basedOn w:val="Normal"/>
     <w:uiPriority w:val="99"/>
     <w:unhideWhenUsed/>
-    <w:rsid w:val="00326F90"/>
     <w:pPr>
       <w:ind w:left="720" w:hanging="360"/>
       <w:contextualSpacing/>
@@ -14388,7 +14231,6 @@
     <w:basedOn w:val="Normal"/>
     <w:uiPriority w:val="99"/>
     <w:unhideWhenUsed/>
-    <w:rsid w:val="00326F90"/>
     <w:pPr>
       <w:ind w:left="1080" w:hanging="360"/>
       <w:contextualSpacing/>
@@ -14399,7 +14241,6 @@
     <w:basedOn w:val="Normal"/>
     <w:uiPriority w:val="99"/>
     <w:unhideWhenUsed/>
-    <w:rsid w:val="00326F90"/>
     <w:pPr>
       <w:numPr>
         <w:numId w:val="1"/>
@@ -14412,7 +14253,6 @@
     <w:basedOn w:val="Normal"/>
     <w:uiPriority w:val="99"/>
     <w:unhideWhenUsed/>
-    <w:rsid w:val="00326F90"/>
     <w:pPr>
       <w:numPr>
         <w:numId w:val="2"/>
@@ -14425,7 +14265,6 @@
     <w:basedOn w:val="Normal"/>
     <w:uiPriority w:val="99"/>
     <w:unhideWhenUsed/>
-    <w:rsid w:val="00326F90"/>
     <w:pPr>
       <w:numPr>
         <w:numId w:val="3"/>
@@ -14438,7 +14277,6 @@
     <w:basedOn w:val="Normal"/>
     <w:uiPriority w:val="99"/>
     <w:unhideWhenUsed/>
-    <w:rsid w:val="00326F90"/>
     <w:pPr>
       <w:numPr>
         <w:numId w:val="5"/>
@@ -14451,7 +14289,6 @@
     <w:basedOn w:val="Normal"/>
     <w:uiPriority w:val="99"/>
     <w:unhideWhenUsed/>
-    <w:rsid w:val="0029639D"/>
     <w:pPr>
       <w:numPr>
         <w:numId w:val="6"/>
@@ -14464,7 +14301,6 @@
     <w:basedOn w:val="Normal"/>
     <w:uiPriority w:val="99"/>
     <w:unhideWhenUsed/>
-    <w:rsid w:val="0029639D"/>
     <w:pPr>
       <w:numPr>
         <w:numId w:val="7"/>
@@ -14477,7 +14313,6 @@
     <w:basedOn w:val="Normal"/>
     <w:uiPriority w:val="99"/>
     <w:unhideWhenUsed/>
-    <w:rsid w:val="0029639D"/>
     <w:pPr>
       <w:spacing w:after="120"/>
       <w:ind w:left="360"/>
@@ -14489,7 +14324,6 @@
     <w:basedOn w:val="Normal"/>
     <w:uiPriority w:val="99"/>
     <w:unhideWhenUsed/>
-    <w:rsid w:val="0029639D"/>
     <w:pPr>
       <w:spacing w:after="120"/>
       <w:ind w:left="720"/>
@@ -14501,7 +14335,6 @@
     <w:basedOn w:val="Normal"/>
     <w:uiPriority w:val="99"/>
     <w:unhideWhenUsed/>
-    <w:rsid w:val="0029639D"/>
     <w:pPr>
       <w:spacing w:after="120"/>
       <w:ind w:left="1080"/>
@@ -14513,7 +14346,6 @@
     <w:link w:val="MacroTextChar"/>
     <w:uiPriority w:val="99"/>
     <w:unhideWhenUsed/>
-    <w:rsid w:val="0029639D"/>
     <w:pPr>
       <w:tabs>
         <w:tab w:val="left" w:pos="576"/>
@@ -14536,7 +14368,6 @@
     <w:basedOn w:val="DefaultParagraphFont"/>
     <w:link w:val="MacroText"/>
     <w:uiPriority w:val="99"/>
-    <w:rsid w:val="0029639D"/>
     <w:rPr>
       <w:rFonts w:ascii="Courier" w:hAnsi="Courier"/>
       <w:sz w:val="20"/>
@@ -14550,7 +14381,6 @@
     <w:link w:val="QuoteChar"/>
     <w:uiPriority w:val="29"/>
     <w:qFormat/>
-    <w:rsid w:val="00FC693F"/>
     <w:rPr>
       <w:i/>
       <w:iCs/>
@@ -14562,7 +14392,6 @@
     <w:basedOn w:val="DefaultParagraphFont"/>
     <w:link w:val="Quote"/>
     <w:uiPriority w:val="29"/>
-    <w:rsid w:val="00FC693F"/>
     <w:rPr>
       <w:i/>
       <w:iCs/>
@@ -14575,7 +14404,6 @@
     <w:link w:val="Heading4"/>
     <w:uiPriority w:val="9"/>
     <w:semiHidden/>
-    <w:rsid w:val="00FC693F"/>
     <w:rPr>
       <w:rFonts w:asciiTheme="majorHAnsi" w:eastAsiaTheme="majorEastAsia" w:hAnsiTheme="majorHAnsi" w:cstheme="majorBidi"/>
       <w:b/>
@@ -14591,7 +14419,6 @@
     <w:link w:val="Heading5"/>
     <w:uiPriority w:val="9"/>
     <w:semiHidden/>
-    <w:rsid w:val="00FC693F"/>
     <w:rPr>
       <w:rFonts w:asciiTheme="majorHAnsi" w:eastAsiaTheme="majorEastAsia" w:hAnsiTheme="majorHAnsi" w:cstheme="majorBidi"/>
       <w:color w:val="243F60" w:themeColor="accent1" w:themeShade="7F"/>
@@ -14603,7 +14430,6 @@
     <w:link w:val="Heading6"/>
     <w:uiPriority w:val="9"/>
     <w:semiHidden/>
-    <w:rsid w:val="00FC693F"/>
     <w:rPr>
       <w:rFonts w:asciiTheme="majorHAnsi" w:eastAsiaTheme="majorEastAsia" w:hAnsiTheme="majorHAnsi" w:cstheme="majorBidi"/>
       <w:i/>
@@ -14617,7 +14443,6 @@
     <w:link w:val="Heading7"/>
     <w:uiPriority w:val="9"/>
     <w:semiHidden/>
-    <w:rsid w:val="00FC693F"/>
     <w:rPr>
       <w:rFonts w:asciiTheme="majorHAnsi" w:eastAsiaTheme="majorEastAsia" w:hAnsiTheme="majorHAnsi" w:cstheme="majorBidi"/>
       <w:i/>
@@ -14631,7 +14456,6 @@
     <w:link w:val="Heading8"/>
     <w:uiPriority w:val="9"/>
     <w:semiHidden/>
-    <w:rsid w:val="00FC693F"/>
     <w:rPr>
       <w:rFonts w:asciiTheme="majorHAnsi" w:eastAsiaTheme="majorEastAsia" w:hAnsiTheme="majorHAnsi" w:cstheme="majorBidi"/>
       <w:color w:val="4F81BD" w:themeColor="accent1"/>
@@ -14645,7 +14469,6 @@
     <w:link w:val="Heading9"/>
     <w:uiPriority w:val="9"/>
     <w:semiHidden/>
-    <w:rsid w:val="00FC693F"/>
     <w:rPr>
       <w:rFonts w:asciiTheme="majorHAnsi" w:eastAsiaTheme="majorEastAsia" w:hAnsiTheme="majorHAnsi" w:cstheme="majorBidi"/>
       <w:i/>
@@ -14663,7 +14486,6 @@
     <w:semiHidden/>
     <w:unhideWhenUsed/>
     <w:qFormat/>
-    <w:rsid w:val="00FC693F"/>
     <w:pPr>
       <w:spacing w:line="240" w:lineRule="auto"/>
     </w:pPr>
@@ -14680,7 +14502,6 @@
     <w:basedOn w:val="DefaultParagraphFont"/>
     <w:uiPriority w:val="22"/>
     <w:qFormat/>
-    <w:rsid w:val="00FC693F"/>
     <w:rPr>
       <w:b/>
       <w:bCs/>
@@ -14691,7 +14512,6 @@
     <w:basedOn w:val="DefaultParagraphFont"/>
     <w:uiPriority w:val="20"/>
     <w:qFormat/>
-    <w:rsid w:val="00FC693F"/>
     <w:rPr>
       <w:i/>
       <w:iCs/>
@@ -14704,7 +14524,6 @@
     <w:link w:val="IntenseQuoteChar"/>
     <w:uiPriority w:val="30"/>
     <w:qFormat/>
-    <w:rsid w:val="00FC693F"/>
     <w:pPr>
       <w:pBdr>
         <w:bottom w:val="single" w:sz="4" w:space="4" w:color="4F81BD" w:themeColor="accent1"/>
@@ -14725,7 +14544,6 @@
     <w:basedOn w:val="DefaultParagraphFont"/>
     <w:link w:val="IntenseQuote"/>
     <w:uiPriority w:val="30"/>
-    <w:rsid w:val="00FC693F"/>
     <w:rPr>
       <w:b/>
       <w:bCs/>
@@ -14739,7 +14557,6 @@
     <w:basedOn w:val="DefaultParagraphFont"/>
     <w:uiPriority w:val="19"/>
     <w:qFormat/>
-    <w:rsid w:val="00FC693F"/>
     <w:rPr>
       <w:i/>
       <w:iCs/>
@@ -14751,7 +14568,6 @@
     <w:basedOn w:val="DefaultParagraphFont"/>
     <w:uiPriority w:val="21"/>
     <w:qFormat/>
-    <w:rsid w:val="00FC693F"/>
     <w:rPr>
       <w:b/>
       <w:bCs/>
@@ -14765,7 +14581,6 @@
     <w:basedOn w:val="DefaultParagraphFont"/>
     <w:uiPriority w:val="31"/>
     <w:qFormat/>
-    <w:rsid w:val="00FC693F"/>
     <w:rPr>
       <w:smallCaps/>
       <w:color w:val="C0504D" w:themeColor="accent2"/>
@@ -14777,7 +14592,6 @@
     <w:basedOn w:val="DefaultParagraphFont"/>
     <w:uiPriority w:val="32"/>
     <w:qFormat/>
-    <w:rsid w:val="00FC693F"/>
     <w:rPr>
       <w:b/>
       <w:bCs/>
@@ -14792,7 +14606,6 @@
     <w:basedOn w:val="DefaultParagraphFont"/>
     <w:uiPriority w:val="33"/>
     <w:qFormat/>
-    <w:rsid w:val="00FC693F"/>
     <w:rPr>
       <w:b/>
       <w:bCs/>
@@ -14808,7 +14621,6 @@
     <w:semiHidden/>
     <w:unhideWhenUsed/>
     <w:qFormat/>
-    <w:rsid w:val="00FC693F"/>
     <w:pPr>
       <w:outlineLvl w:val="9"/>
     </w:pPr>
@@ -14817,7 +14629,6 @@
     <w:name w:val="Table Grid"/>
     <w:basedOn w:val="TableNormal"/>
     <w:uiPriority w:val="59"/>
-    <w:rsid w:val="00FC693F"/>
     <w:pPr>
       <w:spacing w:after="0" w:line="240" w:lineRule="auto"/>
     </w:pPr>
@@ -14843,7 +14654,6 @@
     <w:name w:val="Light Shading"/>
     <w:basedOn w:val="TableNormal"/>
     <w:uiPriority w:val="60"/>
-    <w:rsid w:val="00FC693F"/>
     <w:pPr>
       <w:spacing w:after="0" w:line="240" w:lineRule="auto"/>
     </w:pPr>
@@ -14946,7 +14756,6 @@
     <w:name w:val="Light Shading Accent 1"/>
     <w:basedOn w:val="TableNormal"/>
     <w:uiPriority w:val="60"/>
-    <w:rsid w:val="00FC693F"/>
     <w:pPr>
       <w:spacing w:after="0" w:line="240" w:lineRule="auto"/>
     </w:pPr>
@@ -15049,7 +14858,6 @@
     <w:name w:val="Light Shading Accent 2"/>
     <w:basedOn w:val="TableNormal"/>
     <w:uiPriority w:val="60"/>
-    <w:rsid w:val="00FC693F"/>
     <w:pPr>
       <w:spacing w:after="0" w:line="240" w:lineRule="auto"/>
     </w:pPr>
@@ -15152,7 +14960,6 @@
     <w:name w:val="Light Shading Accent 3"/>
     <w:basedOn w:val="TableNormal"/>
     <w:uiPriority w:val="60"/>
-    <w:rsid w:val="00FC693F"/>
     <w:pPr>
       <w:spacing w:after="0" w:line="240" w:lineRule="auto"/>
     </w:pPr>
@@ -15255,7 +15062,6 @@
     <w:name w:val="Light Shading Accent 4"/>
     <w:basedOn w:val="TableNormal"/>
     <w:uiPriority w:val="60"/>
-    <w:rsid w:val="00FC693F"/>
     <w:pPr>
       <w:spacing w:after="0" w:line="240" w:lineRule="auto"/>
     </w:pPr>
@@ -15358,7 +15164,6 @@
     <w:name w:val="Light Shading Accent 5"/>
     <w:basedOn w:val="TableNormal"/>
     <w:uiPriority w:val="60"/>
-    <w:rsid w:val="00FC693F"/>
     <w:pPr>
       <w:spacing w:after="0" w:line="240" w:lineRule="auto"/>
     </w:pPr>
@@ -15461,7 +15266,6 @@
     <w:name w:val="Light Shading Accent 6"/>
     <w:basedOn w:val="TableNormal"/>
     <w:uiPriority w:val="60"/>
-    <w:rsid w:val="00FC693F"/>
     <w:pPr>
       <w:spacing w:after="0" w:line="240" w:lineRule="auto"/>
     </w:pPr>
@@ -15564,7 +15368,6 @@
     <w:name w:val="Light List"/>
     <w:basedOn w:val="TableNormal"/>
     <w:uiPriority w:val="61"/>
-    <w:rsid w:val="00FC693F"/>
     <w:pPr>
       <w:spacing w:after="0" w:line="240" w:lineRule="auto"/>
     </w:pPr>
@@ -15656,7 +15459,6 @@
     <w:name w:val="Light List Accent 1"/>
     <w:basedOn w:val="TableNormal"/>
     <w:uiPriority w:val="61"/>
-    <w:rsid w:val="00FC693F"/>
     <w:pPr>
       <w:spacing w:after="0" w:line="240" w:lineRule="auto"/>
     </w:pPr>
@@ -15748,7 +15550,6 @@
     <w:name w:val="Light List Accent 2"/>
     <w:basedOn w:val="TableNormal"/>
     <w:uiPriority w:val="61"/>
-    <w:rsid w:val="00CB0664"/>
     <w:pPr>
       <w:spacing w:after="0" w:line="240" w:lineRule="auto"/>
     </w:pPr>
@@ -15840,7 +15641,6 @@
     <w:name w:val="Light List Accent 3"/>
     <w:basedOn w:val="TableNormal"/>
     <w:uiPriority w:val="61"/>
-    <w:rsid w:val="00CB0664"/>
     <w:pPr>
       <w:spacing w:after="0" w:line="240" w:lineRule="auto"/>
     </w:pPr>
@@ -15932,7 +15732,6 @@
     <w:name w:val="Light List Accent 4"/>
     <w:basedOn w:val="TableNormal"/>
     <w:uiPriority w:val="61"/>
-    <w:rsid w:val="00CB0664"/>
     <w:pPr>
       <w:spacing w:after="0" w:line="240" w:lineRule="auto"/>
     </w:pPr>
@@ -16024,7 +15823,6 @@
     <w:name w:val="Light List Accent 5"/>
     <w:basedOn w:val="TableNormal"/>
     <w:uiPriority w:val="61"/>
-    <w:rsid w:val="00CB0664"/>
     <w:pPr>
       <w:spacing w:after="0" w:line="240" w:lineRule="auto"/>
     </w:pPr>
@@ -16116,7 +15914,6 @@
     <w:name w:val="Light List Accent 6"/>
     <w:basedOn w:val="TableNormal"/>
     <w:uiPriority w:val="61"/>
-    <w:rsid w:val="00CB0664"/>
     <w:pPr>
       <w:spacing w:after="0" w:line="240" w:lineRule="auto"/>
     </w:pPr>
@@ -16208,7 +16005,6 @@
     <w:name w:val="Light Grid"/>
     <w:basedOn w:val="TableNormal"/>
     <w:uiPriority w:val="62"/>
-    <w:rsid w:val="00CB0664"/>
     <w:pPr>
       <w:spacing w:after="0" w:line="240" w:lineRule="auto"/>
     </w:pPr>
@@ -16338,7 +16134,6 @@
     <w:name w:val="Light Grid Accent 1"/>
     <w:basedOn w:val="TableNormal"/>
     <w:uiPriority w:val="62"/>
-    <w:rsid w:val="00CB0664"/>
     <w:pPr>
       <w:spacing w:after="0" w:line="240" w:lineRule="auto"/>
     </w:pPr>
@@ -16468,7 +16263,6 @@
     <w:name w:val="Light Grid Accent 2"/>
     <w:basedOn w:val="TableNormal"/>
     <w:uiPriority w:val="62"/>
-    <w:rsid w:val="00CB0664"/>
     <w:pPr>
       <w:spacing w:after="0" w:line="240" w:lineRule="auto"/>
     </w:pPr>
@@ -16598,7 +16392,6 @@
     <w:name w:val="Light Grid Accent 3"/>
     <w:basedOn w:val="TableNormal"/>
     <w:uiPriority w:val="62"/>
-    <w:rsid w:val="00CB0664"/>
     <w:pPr>
       <w:spacing w:after="0" w:line="240" w:lineRule="auto"/>
     </w:pPr>
@@ -16728,7 +16521,6 @@
     <w:name w:val="Light Grid Accent 4"/>
     <w:basedOn w:val="TableNormal"/>
     <w:uiPriority w:val="62"/>
-    <w:rsid w:val="00CB0664"/>
     <w:pPr>
       <w:spacing w:after="0" w:line="240" w:lineRule="auto"/>
     </w:pPr>
@@ -16858,7 +16650,6 @@
     <w:name w:val="Light Grid Accent 5"/>
     <w:basedOn w:val="TableNormal"/>
     <w:uiPriority w:val="62"/>
-    <w:rsid w:val="00CB0664"/>
     <w:pPr>
       <w:spacing w:after="0" w:line="240" w:lineRule="auto"/>
     </w:pPr>
@@ -16988,7 +16779,6 @@
     <w:name w:val="Light Grid Accent 6"/>
     <w:basedOn w:val="TableNormal"/>
     <w:uiPriority w:val="62"/>
-    <w:rsid w:val="00CB0664"/>
     <w:pPr>
       <w:spacing w:after="0" w:line="240" w:lineRule="auto"/>
     </w:pPr>
@@ -17118,7 +16908,6 @@
     <w:name w:val="Medium Shading 1"/>
     <w:basedOn w:val="TableNormal"/>
     <w:uiPriority w:val="63"/>
-    <w:rsid w:val="00CB0664"/>
     <w:pPr>
       <w:spacing w:after="0" w:line="240" w:lineRule="auto"/>
     </w:pPr>
@@ -17224,7 +17013,6 @@
     <w:name w:val="Medium Shading 1 Accent 1"/>
     <w:basedOn w:val="TableNormal"/>
     <w:uiPriority w:val="63"/>
-    <w:rsid w:val="00CB0664"/>
     <w:pPr>
       <w:spacing w:after="0" w:line="240" w:lineRule="auto"/>
     </w:pPr>
@@ -17330,7 +17118,6 @@
     <w:name w:val="Medium Shading 1 Accent 2"/>
     <w:basedOn w:val="TableNormal"/>
     <w:uiPriority w:val="63"/>
-    <w:rsid w:val="00CB0664"/>
     <w:pPr>
       <w:spacing w:after="0" w:line="240" w:lineRule="auto"/>
     </w:pPr>
@@ -17436,7 +17223,6 @@
     <w:name w:val="Medium Shading 1 Accent 3"/>
     <w:basedOn w:val="TableNormal"/>
     <w:uiPriority w:val="63"/>
-    <w:rsid w:val="00CB0664"/>
     <w:pPr>
       <w:spacing w:after="0" w:line="240" w:lineRule="auto"/>
     </w:pPr>
@@ -17542,7 +17328,6 @@
     <w:name w:val="Medium Shading 1 Accent 4"/>
     <w:basedOn w:val="TableNormal"/>
     <w:uiPriority w:val="63"/>
-    <w:rsid w:val="00CB0664"/>
     <w:pPr>
       <w:spacing w:after="0" w:line="240" w:lineRule="auto"/>
     </w:pPr>
@@ -17648,7 +17433,6 @@
     <w:name w:val="Medium Shading 1 Accent 5"/>
     <w:basedOn w:val="TableNormal"/>
     <w:uiPriority w:val="63"/>
-    <w:rsid w:val="00CB0664"/>
     <w:pPr>
       <w:spacing w:after="0" w:line="240" w:lineRule="auto"/>
     </w:pPr>
@@ -17754,7 +17538,6 @@
     <w:name w:val="Medium Shading 1 Accent 6"/>
     <w:basedOn w:val="TableNormal"/>
     <w:uiPriority w:val="63"/>
-    <w:rsid w:val="00CB0664"/>
     <w:pPr>
       <w:spacing w:after="0" w:line="240" w:lineRule="auto"/>
     </w:pPr>
@@ -17860,7 +17643,6 @@
     <w:name w:val="Medium Shading 2"/>
     <w:basedOn w:val="TableNormal"/>
     <w:uiPriority w:val="64"/>
-    <w:rsid w:val="00CB0664"/>
     <w:pPr>
       <w:spacing w:after="0" w:line="240" w:lineRule="auto"/>
     </w:pPr>
@@ -18009,7 +17791,6 @@
     <w:name w:val="Medium Shading 2 Accent 1"/>
     <w:basedOn w:val="TableNormal"/>
     <w:uiPriority w:val="64"/>
-    <w:rsid w:val="00CB0664"/>
     <w:pPr>
       <w:spacing w:after="0" w:line="240" w:lineRule="auto"/>
     </w:pPr>
@@ -18158,7 +17939,6 @@
     <w:name w:val="Medium Shading 2 Accent 2"/>
     <w:basedOn w:val="TableNormal"/>
     <w:uiPriority w:val="64"/>
-    <w:rsid w:val="00CB0664"/>
     <w:pPr>
       <w:spacing w:after="0" w:line="240" w:lineRule="auto"/>
     </w:pPr>
@@ -18307,7 +18087,6 @@
     <w:name w:val="Medium Shading 2 Accent 3"/>
     <w:basedOn w:val="TableNormal"/>
     <w:uiPriority w:val="64"/>
-    <w:rsid w:val="00CB0664"/>
     <w:pPr>
       <w:spacing w:after="0" w:line="240" w:lineRule="auto"/>
     </w:pPr>
@@ -18456,7 +18235,6 @@
     <w:name w:val="Medium Shading 2 Accent 4"/>
     <w:basedOn w:val="TableNormal"/>
     <w:uiPriority w:val="64"/>
-    <w:rsid w:val="00CB0664"/>
     <w:pPr>
       <w:spacing w:after="0" w:line="240" w:lineRule="auto"/>
     </w:pPr>
@@ -18605,7 +18383,6 @@
     <w:name w:val="Medium Shading 2 Accent 5"/>
     <w:basedOn w:val="TableNormal"/>
     <w:uiPriority w:val="64"/>
-    <w:rsid w:val="00CB0664"/>
     <w:pPr>
       <w:spacing w:after="0" w:line="240" w:lineRule="auto"/>
     </w:pPr>
@@ -18754,7 +18531,6 @@
     <w:name w:val="Medium Shading 2 Accent 6"/>
     <w:basedOn w:val="TableNormal"/>
     <w:uiPriority w:val="64"/>
-    <w:rsid w:val="00CB0664"/>
     <w:pPr>
       <w:spacing w:after="0" w:line="240" w:lineRule="auto"/>
     </w:pPr>
@@ -18903,7 +18679,6 @@
     <w:name w:val="Medium List 1"/>
     <w:basedOn w:val="TableNormal"/>
     <w:uiPriority w:val="65"/>
-    <w:rsid w:val="00CB0664"/>
     <w:pPr>
       <w:spacing w:after="0" w:line="240" w:lineRule="auto"/>
     </w:pPr>
@@ -18987,7 +18762,6 @@
     <w:name w:val="Medium List 1 Accent 1"/>
     <w:basedOn w:val="TableNormal"/>
     <w:uiPriority w:val="65"/>
-    <w:rsid w:val="00CB0664"/>
     <w:pPr>
       <w:spacing w:after="0" w:line="240" w:lineRule="auto"/>
     </w:pPr>
@@ -19071,7 +18845,6 @@
     <w:name w:val="Medium List 1 Accent 2"/>
     <w:basedOn w:val="TableNormal"/>
     <w:uiPriority w:val="65"/>
-    <w:rsid w:val="00CB0664"/>
     <w:pPr>
       <w:spacing w:after="0" w:line="240" w:lineRule="auto"/>
     </w:pPr>
@@ -19155,7 +18928,6 @@
     <w:name w:val="Medium List 1 Accent 3"/>
     <w:basedOn w:val="TableNormal"/>
     <w:uiPriority w:val="65"/>
-    <w:rsid w:val="00CB0664"/>
     <w:pPr>
       <w:spacing w:after="0" w:line="240" w:lineRule="auto"/>
     </w:pPr>
@@ -19239,7 +19011,6 @@
     <w:name w:val="Medium List 1 Accent 4"/>
     <w:basedOn w:val="TableNormal"/>
     <w:uiPriority w:val="65"/>
-    <w:rsid w:val="00CB0664"/>
     <w:pPr>
       <w:spacing w:after="0" w:line="240" w:lineRule="auto"/>
     </w:pPr>
@@ -19323,7 +19094,6 @@
     <w:name w:val="Medium List 1 Accent 5"/>
     <w:basedOn w:val="TableNormal"/>
     <w:uiPriority w:val="65"/>
-    <w:rsid w:val="00CB0664"/>
     <w:pPr>
       <w:spacing w:after="0" w:line="240" w:lineRule="auto"/>
     </w:pPr>
@@ -19407,7 +19177,6 @@
     <w:name w:val="Medium List 1 Accent 6"/>
     <w:basedOn w:val="TableNormal"/>
     <w:uiPriority w:val="65"/>
-    <w:rsid w:val="00CB0664"/>
     <w:pPr>
       <w:spacing w:after="0" w:line="240" w:lineRule="auto"/>
     </w:pPr>
@@ -19491,7 +19260,6 @@
     <w:name w:val="Medium List 2"/>
     <w:basedOn w:val="TableNormal"/>
     <w:uiPriority w:val="66"/>
-    <w:rsid w:val="00CB0664"/>
     <w:pPr>
       <w:spacing w:after="0" w:line="240" w:lineRule="auto"/>
     </w:pPr>
@@ -19619,7 +19387,6 @@
     <w:name w:val="Medium List 2 Accent 1"/>
     <w:basedOn w:val="TableNormal"/>
     <w:uiPriority w:val="66"/>
-    <w:rsid w:val="00CB0664"/>
     <w:pPr>
       <w:spacing w:after="0" w:line="240" w:lineRule="auto"/>
     </w:pPr>
@@ -19747,7 +19514,6 @@
     <w:name w:val="Medium List 2 Accent 2"/>
     <w:basedOn w:val="TableNormal"/>
     <w:uiPriority w:val="66"/>
-    <w:rsid w:val="00CB0664"/>
     <w:pPr>
       <w:spacing w:after="0" w:line="240" w:lineRule="auto"/>
     </w:pPr>
@@ -19875,7 +19641,6 @@
     <w:name w:val="Medium List 2 Accent 3"/>
     <w:basedOn w:val="TableNormal"/>
     <w:uiPriority w:val="66"/>
-    <w:rsid w:val="00CB0664"/>
     <w:pPr>
       <w:spacing w:after="0" w:line="240" w:lineRule="auto"/>
     </w:pPr>
@@ -20003,7 +19768,6 @@
     <w:name w:val="Medium List 2 Accent 4"/>
     <w:basedOn w:val="TableNormal"/>
     <w:uiPriority w:val="66"/>
-    <w:rsid w:val="00CB0664"/>
     <w:pPr>
       <w:spacing w:after="0" w:line="240" w:lineRule="auto"/>
     </w:pPr>
@@ -20131,7 +19895,6 @@
     <w:name w:val="Medium List 2 Accent 5"/>
     <w:basedOn w:val="TableNormal"/>
     <w:uiPriority w:val="66"/>
-    <w:rsid w:val="00CB0664"/>
     <w:pPr>
       <w:spacing w:after="0" w:line="240" w:lineRule="auto"/>
     </w:pPr>
@@ -20259,7 +20022,6 @@
     <w:name w:val="Medium List 2 Accent 6"/>
     <w:basedOn w:val="TableNormal"/>
     <w:uiPriority w:val="66"/>
-    <w:rsid w:val="00CB0664"/>
     <w:pPr>
       <w:spacing w:after="0" w:line="240" w:lineRule="auto"/>
     </w:pPr>
@@ -20387,7 +20149,6 @@
     <w:name w:val="Medium Grid 1"/>
     <w:basedOn w:val="TableNormal"/>
     <w:uiPriority w:val="67"/>
-    <w:rsid w:val="00CB0664"/>
     <w:pPr>
       <w:spacing w:after="0" w:line="240" w:lineRule="auto"/>
     </w:pPr>
@@ -20460,7 +20221,6 @@
     <w:name w:val="Medium Grid 1 Accent 1"/>
     <w:basedOn w:val="TableNormal"/>
     <w:uiPriority w:val="67"/>
-    <w:rsid w:val="00CB0664"/>
     <w:pPr>
       <w:spacing w:after="0" w:line="240" w:lineRule="auto"/>
     </w:pPr>
@@ -20533,7 +20293,6 @@
     <w:name w:val="Medium Grid 1 Accent 2"/>
     <w:basedOn w:val="TableNormal"/>
     <w:uiPriority w:val="67"/>
-    <w:rsid w:val="00CB0664"/>
     <w:pPr>
       <w:spacing w:after="0" w:line="240" w:lineRule="auto"/>
     </w:pPr>
@@ -20606,7 +20365,6 @@
     <w:name w:val="Medium Grid 1 Accent 3"/>
     <w:basedOn w:val="TableNormal"/>
     <w:uiPriority w:val="67"/>
-    <w:rsid w:val="00CB0664"/>
     <w:pPr>
       <w:spacing w:after="0" w:line="240" w:lineRule="auto"/>
     </w:pPr>
@@ -20679,7 +20437,6 @@
     <w:name w:val="Medium Grid 1 Accent 4"/>
     <w:basedOn w:val="TableNormal"/>
     <w:uiPriority w:val="67"/>
-    <w:rsid w:val="00CB0664"/>
     <w:pPr>
       <w:spacing w:after="0" w:line="240" w:lineRule="auto"/>
     </w:pPr>
@@ -20752,7 +20509,6 @@
     <w:name w:val="Medium Grid 1 Accent 5"/>
     <w:basedOn w:val="TableNormal"/>
     <w:uiPriority w:val="67"/>
-    <w:rsid w:val="00CB0664"/>
     <w:pPr>
       <w:spacing w:after="0" w:line="240" w:lineRule="auto"/>
     </w:pPr>
@@ -20825,7 +20581,6 @@
     <w:name w:val="Medium Grid 1 Accent 6"/>
     <w:basedOn w:val="TableNormal"/>
     <w:uiPriority w:val="67"/>
-    <w:rsid w:val="00CB0664"/>
     <w:pPr>
       <w:spacing w:after="0" w:line="240" w:lineRule="auto"/>
     </w:pPr>
@@ -20898,7 +20653,6 @@
     <w:name w:val="Medium Grid 2"/>
     <w:basedOn w:val="TableNormal"/>
     <w:uiPriority w:val="68"/>
-    <w:rsid w:val="00CB0664"/>
     <w:pPr>
       <w:spacing w:after="0" w:line="240" w:lineRule="auto"/>
     </w:pPr>
@@ -21023,7 +20777,6 @@
     <w:name w:val="Medium Grid 2 Accent 1"/>
     <w:basedOn w:val="TableNormal"/>
     <w:uiPriority w:val="68"/>
-    <w:rsid w:val="00CB0664"/>
     <w:pPr>
       <w:spacing w:after="0" w:line="240" w:lineRule="auto"/>
     </w:pPr>
@@ -21148,7 +20901,6 @@
     <w:name w:val="Medium Grid 2 Accent 2"/>
     <w:basedOn w:val="TableNormal"/>
     <w:uiPriority w:val="68"/>
-    <w:rsid w:val="00CB0664"/>
     <w:pPr>
       <w:spacing w:after="0" w:line="240" w:lineRule="auto"/>
     </w:pPr>
@@ -21273,7 +21025,6 @@
     <w:name w:val="Medium Grid 2 Accent 3"/>
     <w:basedOn w:val="TableNormal"/>
     <w:uiPriority w:val="68"/>
-    <w:rsid w:val="00CB0664"/>
     <w:pPr>
       <w:spacing w:after="0" w:line="240" w:lineRule="auto"/>
     </w:pPr>
@@ -21398,7 +21149,6 @@
     <w:name w:val="Medium Grid 2 Accent 4"/>
     <w:basedOn w:val="TableNormal"/>
     <w:uiPriority w:val="68"/>
-    <w:rsid w:val="00CB0664"/>
     <w:pPr>
       <w:spacing w:after="0" w:line="240" w:lineRule="auto"/>
     </w:pPr>
@@ -21523,7 +21273,6 @@
     <w:name w:val="Medium Grid 2 Accent 5"/>
     <w:basedOn w:val="TableNormal"/>
     <w:uiPriority w:val="68"/>
-    <w:rsid w:val="00CB0664"/>
     <w:pPr>
       <w:spacing w:after="0" w:line="240" w:lineRule="auto"/>
     </w:pPr>
@@ -21648,7 +21397,6 @@
     <w:name w:val="Medium Grid 2 Accent 6"/>
     <w:basedOn w:val="TableNormal"/>
     <w:uiPriority w:val="68"/>
-    <w:rsid w:val="00CB0664"/>
     <w:pPr>
       <w:spacing w:after="0" w:line="240" w:lineRule="auto"/>
     </w:pPr>
@@ -21773,7 +21521,6 @@
     <w:name w:val="Medium Grid 3"/>
     <w:basedOn w:val="TableNormal"/>
     <w:uiPriority w:val="69"/>
-    <w:rsid w:val="00CB0664"/>
     <w:pPr>
       <w:spacing w:after="0" w:line="240" w:lineRule="auto"/>
     </w:pPr>
@@ -21914,7 +21661,6 @@
     <w:name w:val="Medium Grid 3 Accent 1"/>
     <w:basedOn w:val="TableNormal"/>
     <w:uiPriority w:val="69"/>
-    <w:rsid w:val="00CB0664"/>
     <w:pPr>
       <w:spacing w:after="0" w:line="240" w:lineRule="auto"/>
     </w:pPr>
@@ -22055,7 +21801,6 @@
     <w:name w:val="Medium Grid 3 Accent 2"/>
     <w:basedOn w:val="TableNormal"/>
     <w:uiPriority w:val="69"/>
-    <w:rsid w:val="00CB0664"/>
     <w:pPr>
       <w:spacing w:after="0" w:line="240" w:lineRule="auto"/>
     </w:pPr>
@@ -22196,7 +21941,6 @@
     <w:name w:val="Medium Grid 3 Accent 3"/>
     <w:basedOn w:val="TableNormal"/>
     <w:uiPriority w:val="69"/>
-    <w:rsid w:val="00CB0664"/>
     <w:pPr>
       <w:spacing w:after="0" w:line="240" w:lineRule="auto"/>
     </w:pPr>
@@ -22337,7 +22081,6 @@
     <w:name w:val="Medium Grid 3 Accent 4"/>
     <w:basedOn w:val="TableNormal"/>
     <w:uiPriority w:val="69"/>
-    <w:rsid w:val="00CB0664"/>
     <w:pPr>
       <w:spacing w:after="0" w:line="240" w:lineRule="auto"/>
     </w:pPr>
@@ -22478,7 +22221,6 @@
     <w:name w:val="Medium Grid 3 Accent 5"/>
     <w:basedOn w:val="TableNormal"/>
     <w:uiPriority w:val="69"/>
-    <w:rsid w:val="00CB0664"/>
     <w:pPr>
       <w:spacing w:after="0" w:line="240" w:lineRule="auto"/>
     </w:pPr>
@@ -22619,7 +22361,6 @@
     <w:name w:val="Medium Grid 3 Accent 6"/>
     <w:basedOn w:val="TableNormal"/>
     <w:uiPriority w:val="69"/>
-    <w:rsid w:val="00CB0664"/>
     <w:pPr>
       <w:spacing w:after="0" w:line="240" w:lineRule="auto"/>
     </w:pPr>
@@ -22760,7 +22501,6 @@
     <w:name w:val="Dark List"/>
     <w:basedOn w:val="TableNormal"/>
     <w:uiPriority w:val="70"/>
-    <w:rsid w:val="00CB0664"/>
     <w:pPr>
       <w:spacing w:after="0" w:line="240" w:lineRule="auto"/>
     </w:pPr>
@@ -22874,7 +22614,6 @@
     <w:name w:val="Dark List Accent 1"/>
     <w:basedOn w:val="TableNormal"/>
     <w:uiPriority w:val="70"/>
-    <w:rsid w:val="00CB0664"/>
     <w:pPr>
       <w:spacing w:after="0" w:line="240" w:lineRule="auto"/>
     </w:pPr>
@@ -22988,7 +22727,6 @@
     <w:name w:val="Dark List Accent 2"/>
     <w:basedOn w:val="TableNormal"/>
     <w:uiPriority w:val="70"/>
-    <w:rsid w:val="00CB0664"/>
     <w:pPr>
       <w:spacing w:after="0" w:line="240" w:lineRule="auto"/>
     </w:pPr>
@@ -23102,7 +22840,6 @@
     <w:name w:val="Dark List Accent 3"/>
     <w:basedOn w:val="TableNormal"/>
     <w:uiPriority w:val="70"/>
-    <w:rsid w:val="00CB0664"/>
     <w:pPr>
       <w:spacing w:after="0" w:line="240" w:lineRule="auto"/>
     </w:pPr>
@@ -23216,7 +22953,6 @@
     <w:name w:val="Dark List Accent 4"/>
     <w:basedOn w:val="TableNormal"/>
     <w:uiPriority w:val="70"/>
-    <w:rsid w:val="00CB0664"/>
     <w:pPr>
       <w:spacing w:after="0" w:line="240" w:lineRule="auto"/>
     </w:pPr>
@@ -23330,7 +23066,6 @@
     <w:name w:val="Dark List Accent 5"/>
     <w:basedOn w:val="TableNormal"/>
     <w:uiPriority w:val="70"/>
-    <w:rsid w:val="00CB0664"/>
     <w:pPr>
       <w:spacing w:after="0" w:line="240" w:lineRule="auto"/>
     </w:pPr>
@@ -23444,7 +23179,6 @@
     <w:name w:val="Dark List Accent 6"/>
     <w:basedOn w:val="TableNormal"/>
     <w:uiPriority w:val="70"/>
-    <w:rsid w:val="00CB0664"/>
     <w:pPr>
       <w:spacing w:after="0" w:line="240" w:lineRule="auto"/>
     </w:pPr>
@@ -23558,7 +23292,6 @@
     <w:name w:val="Colorful Shading"/>
     <w:basedOn w:val="TableNormal"/>
     <w:uiPriority w:val="71"/>
-    <w:rsid w:val="00CB0664"/>
     <w:pPr>
       <w:spacing w:after="0" w:line="240" w:lineRule="auto"/>
     </w:pPr>
@@ -23680,7 +23413,6 @@
     <w:name w:val="Colorful Shading Accent 1"/>
     <w:basedOn w:val="TableNormal"/>
     <w:uiPriority w:val="71"/>
-    <w:rsid w:val="00CB0664"/>
     <w:pPr>
       <w:spacing w:after="0" w:line="240" w:lineRule="auto"/>
     </w:pPr>
@@ -23802,7 +23534,6 @@
     <w:name w:val="Colorful Shading Accent 2"/>
     <w:basedOn w:val="TableNormal"/>
     <w:uiPriority w:val="71"/>
-    <w:rsid w:val="00CB0664"/>
     <w:pPr>
       <w:spacing w:after="0" w:line="240" w:lineRule="auto"/>
     </w:pPr>
@@ -23924,7 +23655,6 @@
     <w:name w:val="Colorful Shading Accent 3"/>
     <w:basedOn w:val="TableNormal"/>
     <w:uiPriority w:val="71"/>
-    <w:rsid w:val="00CB0664"/>
     <w:pPr>
       <w:spacing w:after="0" w:line="240" w:lineRule="auto"/>
     </w:pPr>
@@ -24036,7 +23766,6 @@
     <w:name w:val="Colorful Shading Accent 4"/>
     <w:basedOn w:val="TableNormal"/>
     <w:uiPriority w:val="71"/>
-    <w:rsid w:val="00CB0664"/>
     <w:pPr>
       <w:spacing w:after="0" w:line="240" w:lineRule="auto"/>
     </w:pPr>
@@ -24158,7 +23887,6 @@
     <w:name w:val="Colorful Shading Accent 5"/>
     <w:basedOn w:val="TableNormal"/>
     <w:uiPriority w:val="71"/>
-    <w:rsid w:val="00CB0664"/>
     <w:pPr>
       <w:spacing w:after="0" w:line="240" w:lineRule="auto"/>
     </w:pPr>
@@ -24280,7 +24008,6 @@
     <w:name w:val="Colorful Shading Accent 6"/>
     <w:basedOn w:val="TableNormal"/>
     <w:uiPriority w:val="71"/>
-    <w:rsid w:val="00CB0664"/>
     <w:pPr>
       <w:spacing w:after="0" w:line="240" w:lineRule="auto"/>
     </w:pPr>
@@ -24402,7 +24129,6 @@
     <w:name w:val="Colorful List"/>
     <w:basedOn w:val="TableNormal"/>
     <w:uiPriority w:val="72"/>
-    <w:rsid w:val="00CB0664"/>
     <w:pPr>
       <w:spacing w:after="0" w:line="240" w:lineRule="auto"/>
     </w:pPr>
@@ -24488,7 +24214,6 @@
     <w:name w:val="Colorful List Accent 1"/>
     <w:basedOn w:val="TableNormal"/>
     <w:uiPriority w:val="72"/>
-    <w:rsid w:val="00CB0664"/>
     <w:pPr>
       <w:spacing w:after="0" w:line="240" w:lineRule="auto"/>
     </w:pPr>
@@ -24574,7 +24299,6 @@
     <w:name w:val="Colorful List Accent 2"/>
     <w:basedOn w:val="TableNormal"/>
     <w:uiPriority w:val="72"/>
-    <w:rsid w:val="00CB0664"/>
     <w:pPr>
       <w:spacing w:after="0" w:line="240" w:lineRule="auto"/>
     </w:pPr>
@@ -24660,7 +24384,6 @@
     <w:name w:val="Colorful List Accent 3"/>
     <w:basedOn w:val="TableNormal"/>
     <w:uiPriority w:val="72"/>
-    <w:rsid w:val="00CB0664"/>
     <w:pPr>
       <w:spacing w:after="0" w:line="240" w:lineRule="auto"/>
     </w:pPr>
@@ -24746,7 +24469,6 @@
     <w:name w:val="Colorful List Accent 4"/>
     <w:basedOn w:val="TableNormal"/>
     <w:uiPriority w:val="72"/>
-    <w:rsid w:val="00CB0664"/>
     <w:pPr>
       <w:spacing w:after="0" w:line="240" w:lineRule="auto"/>
     </w:pPr>
@@ -24832,7 +24554,6 @@
     <w:name w:val="Colorful List Accent 5"/>
     <w:basedOn w:val="TableNormal"/>
     <w:uiPriority w:val="72"/>
-    <w:rsid w:val="00CB0664"/>
     <w:pPr>
       <w:spacing w:after="0" w:line="240" w:lineRule="auto"/>
     </w:pPr>
@@ -24918,7 +24639,6 @@
     <w:name w:val="Colorful List Accent 6"/>
     <w:basedOn w:val="TableNormal"/>
     <w:uiPriority w:val="72"/>
-    <w:rsid w:val="00CB0664"/>
     <w:pPr>
       <w:spacing w:after="0" w:line="240" w:lineRule="auto"/>
     </w:pPr>
@@ -25004,7 +24724,6 @@
     <w:name w:val="Colorful Grid"/>
     <w:basedOn w:val="TableNormal"/>
     <w:uiPriority w:val="73"/>
-    <w:rsid w:val="00CB0664"/>
     <w:pPr>
       <w:spacing w:after="0" w:line="240" w:lineRule="auto"/>
     </w:pPr>
@@ -25084,7 +24803,6 @@
     <w:name w:val="Colorful Grid Accent 1"/>
     <w:basedOn w:val="TableNormal"/>
     <w:uiPriority w:val="73"/>
-    <w:rsid w:val="00CB0664"/>
     <w:pPr>
       <w:spacing w:after="0" w:line="240" w:lineRule="auto"/>
     </w:pPr>
@@ -25164,7 +24882,6 @@
     <w:name w:val="Colorful Grid Accent 2"/>
     <w:basedOn w:val="TableNormal"/>
     <w:uiPriority w:val="73"/>
-    <w:rsid w:val="00CB0664"/>
     <w:pPr>
       <w:spacing w:after="0" w:line="240" w:lineRule="auto"/>
     </w:pPr>
@@ -25244,7 +24961,6 @@
     <w:name w:val="Colorful Grid Accent 3"/>
     <w:basedOn w:val="TableNormal"/>
     <w:uiPriority w:val="73"/>
-    <w:rsid w:val="00CB0664"/>
     <w:pPr>
       <w:spacing w:after="0" w:line="240" w:lineRule="auto"/>
     </w:pPr>
@@ -25324,7 +25040,6 @@
     <w:name w:val="Colorful Grid Accent 4"/>
     <w:basedOn w:val="TableNormal"/>
     <w:uiPriority w:val="73"/>
-    <w:rsid w:val="00CB0664"/>
     <w:pPr>
       <w:spacing w:after="0" w:line="240" w:lineRule="auto"/>
     </w:pPr>
@@ -25404,7 +25119,6 @@
     <w:name w:val="Colorful Grid Accent 5"/>
     <w:basedOn w:val="TableNormal"/>
     <w:uiPriority w:val="73"/>
-    <w:rsid w:val="00CB0664"/>
     <w:pPr>
       <w:spacing w:after="0" w:line="240" w:lineRule="auto"/>
     </w:pPr>
@@ -25484,7 +25198,6 @@
     <w:name w:val="Colorful Grid Accent 6"/>
     <w:basedOn w:val="TableNormal"/>
     <w:uiPriority w:val="73"/>
-    <w:rsid w:val="00CB0664"/>
     <w:pPr>
       <w:spacing w:after="0" w:line="240" w:lineRule="auto"/>
     </w:pPr>

</xml_diff>